<commit_message>
changing robustness output files
</commit_message>
<xml_diff>
--- a/robustness_sim_2/results/table_output2.docx
+++ b/robustness_sim_2/results/table_output2.docx
@@ -9,13 +9,13 @@
         <w:tblLook w:firstRow="1" w:lastRow="0" w:firstColumn="0" w:lastColumn="0" w:noHBand="0" w:noVBand="1"/>
       </w:tblPr>
       <w:tblGrid>
-        <w:gridCol w:w="1511"/>
-        <w:gridCol w:w="1560"/>
-        <w:gridCol w:w="2648"/>
+        <w:gridCol w:w="1080"/>
+        <w:gridCol w:w="1080"/>
+        <w:gridCol w:w="1080"/>
       </w:tblGrid>
       <w:tr>
         <w:trPr>
-          <w:trHeight w:val="621" w:hRule="auto"/>
+          <w:trHeight w:val="360" w:hRule="auto"/>
           <w:tblHeader/>
         </w:trPr>
         header 1
@@ -181,7 +181,7 @@
       </w:tr>
       <w:tr>
         <w:trPr>
-          <w:trHeight w:val="577" w:hRule="auto"/>
+          <w:trHeight w:val="360" w:hRule="auto"/>
         </w:trPr>
         body 1
         <w:tc>
@@ -233,6 +233,59 @@
                 <w:szCs w:val="22"/>
                 <w:color w:val="000000"/>
               </w:rPr>
+              <w:t xml:space="preserve">Geom (mean: 21 bp)</w:t>
+            </w:r>
+          </w:p>
+        </w:tc>
+        <w:tc>
+          <w:tcPr>
+            <w:tcBorders>
+              <w:bottom w:val="none" w:sz="0" w:space="0" w:color="000000"/>
+              <w:top w:val="single" w:sz="12" w:space="0" w:color="666666"/>
+              <w:left w:val="none" w:sz="0" w:space="0" w:color="000000"/>
+              <w:right w:val="none" w:sz="0" w:space="0" w:color="000000"/>
+            </w:tcBorders>
+            <w:shd w:val="clear" w:color="auto" w:fill="FFFFFF"/>
+            <w:tcMar>
+              <w:top w:w="0" w:type="dxa"/>
+              <w:bottom w:w="0" w:type="dxa"/>
+              <w:left w:w="0" w:type="dxa"/>
+              <w:right w:w="0" w:type="dxa"/>
+            </w:tcMar>
+            <w:vAlign w:val="center"/>
+          </w:tcPr>
+          <w:p>
+            <w:pPr>
+              <w:pStyle w:val="Normal"/>
+              <w:jc w:val="left"/>
+              <w:pBdr>
+                <w:bottom w:val="none" w:sz="0" w:space="0" w:color="000000"/>
+                <w:top w:val="none" w:sz="0" w:space="0" w:color="000000"/>
+                <w:left w:val="none" w:sz="0" w:space="0" w:color="000000"/>
+                <w:right w:val="none" w:sz="0" w:space="0" w:color="000000"/>
+              </w:pBdr>
+              <w:spacing w:after="100" w:before="100" w:line="240"/>
+              <w:ind w:left="100" w:right="100" w:firstLine="0" w:firstLineChars="0"/>
+              <w:rPr>
+                <w:rFonts w:ascii="Helvetica" w:hAnsi="Helvetica" w:eastAsia="Helvetica" w:cs="Helvetica"/>
+                <w:i w:val="false"/>
+                <w:b w:val="false"/>
+                <w:u w:val="none"/>
+                <w:sz w:val="22"/>
+                <w:szCs w:val="22"/>
+                <w:color w:val="000000"/>
+              </w:rPr>
+            </w:pPr>
+            <w:r>
+              <w:rPr>
+                <w:rFonts w:ascii="Helvetica" w:hAnsi="Helvetica" w:eastAsia="Helvetica" w:cs="Helvetica"/>
+                <w:i w:val="false"/>
+                <w:b w:val="false"/>
+                <w:u w:val="none"/>
+                <w:sz w:val="22"/>
+                <w:szCs w:val="22"/>
+                <w:color w:val="000000"/>
+              </w:rPr>
               <w:t xml:space="preserve">Geom</w:t>
             </w:r>
           </w:p>
@@ -257,59 +310,6 @@
           <w:p>
             <w:pPr>
               <w:pStyle w:val="Normal"/>
-              <w:jc w:val="left"/>
-              <w:pBdr>
-                <w:bottom w:val="none" w:sz="0" w:space="0" w:color="000000"/>
-                <w:top w:val="none" w:sz="0" w:space="0" w:color="000000"/>
-                <w:left w:val="none" w:sz="0" w:space="0" w:color="000000"/>
-                <w:right w:val="none" w:sz="0" w:space="0" w:color="000000"/>
-              </w:pBdr>
-              <w:spacing w:after="100" w:before="100" w:line="240"/>
-              <w:ind w:left="100" w:right="100" w:firstLine="0" w:firstLineChars="0"/>
-              <w:rPr>
-                <w:rFonts w:ascii="Helvetica" w:hAnsi="Helvetica" w:eastAsia="Helvetica" w:cs="Helvetica"/>
-                <w:i w:val="false"/>
-                <w:b w:val="false"/>
-                <w:u w:val="none"/>
-                <w:sz w:val="22"/>
-                <w:szCs w:val="22"/>
-                <w:color w:val="000000"/>
-              </w:rPr>
-            </w:pPr>
-            <w:r>
-              <w:rPr>
-                <w:rFonts w:ascii="Helvetica" w:hAnsi="Helvetica" w:eastAsia="Helvetica" w:cs="Helvetica"/>
-                <w:i w:val="false"/>
-                <w:b w:val="false"/>
-                <w:u w:val="none"/>
-                <w:sz w:val="22"/>
-                <w:szCs w:val="22"/>
-                <w:color w:val="000000"/>
-              </w:rPr>
-              <w:t xml:space="preserve">Mixture</w:t>
-            </w:r>
-          </w:p>
-        </w:tc>
-        <w:tc>
-          <w:tcPr>
-            <w:tcBorders>
-              <w:bottom w:val="none" w:sz="0" w:space="0" w:color="000000"/>
-              <w:top w:val="single" w:sz="12" w:space="0" w:color="666666"/>
-              <w:left w:val="none" w:sz="0" w:space="0" w:color="000000"/>
-              <w:right w:val="none" w:sz="0" w:space="0" w:color="000000"/>
-            </w:tcBorders>
-            <w:shd w:val="clear" w:color="auto" w:fill="FFFFFF"/>
-            <w:tcMar>
-              <w:top w:w="0" w:type="dxa"/>
-              <w:bottom w:w="0" w:type="dxa"/>
-              <w:left w:w="0" w:type="dxa"/>
-              <w:right w:w="0" w:type="dxa"/>
-            </w:tcMar>
-            <w:vAlign w:val="center"/>
-          </w:tcPr>
-          <w:p>
-            <w:pPr>
-              <w:pStyle w:val="Normal"/>
               <w:jc w:val="right"/>
               <w:pBdr>
                 <w:bottom w:val="none" w:sz="0" w:space="0" w:color="000000"/>
@@ -339,14 +339,14 @@
                 <w:szCs w:val="22"/>
                 <w:color w:val="000000"/>
               </w:rPr>
-              <w:t xml:space="preserve">0</w:t>
+              <w:t xml:space="preserve">48</w:t>
             </w:r>
           </w:p>
         </w:tc>
       </w:tr>
       <w:tr>
         <w:trPr>
-          <w:trHeight w:val="577" w:hRule="auto"/>
+          <w:trHeight w:val="360" w:hRule="auto"/>
         </w:trPr>
         body 2
         <w:tc>
@@ -398,7 +398,7 @@
                 <w:szCs w:val="22"/>
                 <w:color w:val="000000"/>
               </w:rPr>
-              <w:t xml:space="preserve">Geom</w:t>
+              <w:t xml:space="preserve">Geom (mean: 21 bp)</w:t>
             </w:r>
           </w:p>
         </w:tc>
@@ -451,7 +451,7 @@
                 <w:szCs w:val="22"/>
                 <w:color w:val="000000"/>
               </w:rPr>
-              <w:t xml:space="preserve">Geom</w:t>
+              <w:t xml:space="preserve">Geom2</w:t>
             </w:r>
           </w:p>
         </w:tc>
@@ -504,14 +504,14 @@
                 <w:szCs w:val="22"/>
                 <w:color w:val="000000"/>
               </w:rPr>
-              <w:t xml:space="preserve">66</w:t>
+              <w:t xml:space="preserve">52</w:t>
             </w:r>
           </w:p>
         </w:tc>
       </w:tr>
       <w:tr>
         <w:trPr>
-          <w:trHeight w:val="577" w:hRule="auto"/>
+          <w:trHeight w:val="360" w:hRule="auto"/>
         </w:trPr>
         body 3
         <w:tc>
@@ -563,7 +563,7 @@
                 <w:szCs w:val="22"/>
                 <w:color w:val="000000"/>
               </w:rPr>
-              <w:t xml:space="preserve">Geom</w:t>
+              <w:t xml:space="preserve">Geom (mean: 21 bp)</w:t>
             </w:r>
           </w:p>
         </w:tc>
@@ -616,7 +616,7 @@
                 <w:szCs w:val="22"/>
                 <w:color w:val="000000"/>
               </w:rPr>
-              <w:t xml:space="preserve">Geom2</w:t>
+              <w:t xml:space="preserve">Mixture</w:t>
             </w:r>
           </w:p>
         </w:tc>
@@ -669,14 +669,14 @@
                 <w:szCs w:val="22"/>
                 <w:color w:val="000000"/>
               </w:rPr>
-              <w:t xml:space="preserve">34</w:t>
+              <w:t xml:space="preserve">0</w:t>
             </w:r>
           </w:p>
         </w:tc>
       </w:tr>
       <w:tr>
         <w:trPr>
-          <w:trHeight w:val="577" w:hRule="auto"/>
+          <w:trHeight w:val="360" w:hRule="auto"/>
         </w:trPr>
         body 4
         <w:tc>
@@ -728,7 +728,7 @@
                 <w:szCs w:val="22"/>
                 <w:color w:val="000000"/>
               </w:rPr>
-              <w:t xml:space="preserve">Geom2</w:t>
+              <w:t xml:space="preserve">Geom (mean: 100 bp)</w:t>
             </w:r>
           </w:p>
         </w:tc>
@@ -781,7 +781,7 @@
                 <w:szCs w:val="22"/>
                 <w:color w:val="000000"/>
               </w:rPr>
-              <w:t xml:space="preserve">Mixture</w:t>
+              <w:t xml:space="preserve">Geom</w:t>
             </w:r>
           </w:p>
         </w:tc>
@@ -834,14 +834,14 @@
                 <w:szCs w:val="22"/>
                 <w:color w:val="000000"/>
               </w:rPr>
-              <w:t xml:space="preserve">0</w:t>
+              <w:t xml:space="preserve">78</w:t>
             </w:r>
           </w:p>
         </w:tc>
       </w:tr>
       <w:tr>
         <w:trPr>
-          <w:trHeight w:val="577" w:hRule="auto"/>
+          <w:trHeight w:val="360" w:hRule="auto"/>
         </w:trPr>
         body 5
         <w:tc>
@@ -893,6 +893,59 @@
                 <w:szCs w:val="22"/>
                 <w:color w:val="000000"/>
               </w:rPr>
+              <w:t xml:space="preserve">Geom (mean: 100 bp)</w:t>
+            </w:r>
+          </w:p>
+        </w:tc>
+        <w:tc>
+          <w:tcPr>
+            <w:tcBorders>
+              <w:bottom w:val="none" w:sz="0" w:space="0" w:color="000000"/>
+              <w:top w:val="none" w:sz="0" w:space="0" w:color="000000"/>
+              <w:left w:val="none" w:sz="0" w:space="0" w:color="000000"/>
+              <w:right w:val="none" w:sz="0" w:space="0" w:color="000000"/>
+            </w:tcBorders>
+            <w:shd w:val="clear" w:color="auto" w:fill="FFFFFF"/>
+            <w:tcMar>
+              <w:top w:w="0" w:type="dxa"/>
+              <w:bottom w:w="0" w:type="dxa"/>
+              <w:left w:w="0" w:type="dxa"/>
+              <w:right w:w="0" w:type="dxa"/>
+            </w:tcMar>
+            <w:vAlign w:val="center"/>
+          </w:tcPr>
+          <w:p>
+            <w:pPr>
+              <w:pStyle w:val="Normal"/>
+              <w:jc w:val="left"/>
+              <w:pBdr>
+                <w:bottom w:val="none" w:sz="0" w:space="0" w:color="000000"/>
+                <w:top w:val="none" w:sz="0" w:space="0" w:color="000000"/>
+                <w:left w:val="none" w:sz="0" w:space="0" w:color="000000"/>
+                <w:right w:val="none" w:sz="0" w:space="0" w:color="000000"/>
+              </w:pBdr>
+              <w:spacing w:after="100" w:before="100" w:line="240"/>
+              <w:ind w:left="100" w:right="100" w:firstLine="0" w:firstLineChars="0"/>
+              <w:rPr>
+                <w:rFonts w:ascii="Helvetica" w:hAnsi="Helvetica" w:eastAsia="Helvetica" w:cs="Helvetica"/>
+                <w:i w:val="false"/>
+                <w:b w:val="false"/>
+                <w:u w:val="none"/>
+                <w:sz w:val="22"/>
+                <w:szCs w:val="22"/>
+                <w:color w:val="000000"/>
+              </w:rPr>
+            </w:pPr>
+            <w:r>
+              <w:rPr>
+                <w:rFonts w:ascii="Helvetica" w:hAnsi="Helvetica" w:eastAsia="Helvetica" w:cs="Helvetica"/>
+                <w:i w:val="false"/>
+                <w:b w:val="false"/>
+                <w:u w:val="none"/>
+                <w:sz w:val="22"/>
+                <w:szCs w:val="22"/>
+                <w:color w:val="000000"/>
+              </w:rPr>
               <w:t xml:space="preserve">Geom2</w:t>
             </w:r>
           </w:p>
@@ -917,59 +970,6 @@
           <w:p>
             <w:pPr>
               <w:pStyle w:val="Normal"/>
-              <w:jc w:val="left"/>
-              <w:pBdr>
-                <w:bottom w:val="none" w:sz="0" w:space="0" w:color="000000"/>
-                <w:top w:val="none" w:sz="0" w:space="0" w:color="000000"/>
-                <w:left w:val="none" w:sz="0" w:space="0" w:color="000000"/>
-                <w:right w:val="none" w:sz="0" w:space="0" w:color="000000"/>
-              </w:pBdr>
-              <w:spacing w:after="100" w:before="100" w:line="240"/>
-              <w:ind w:left="100" w:right="100" w:firstLine="0" w:firstLineChars="0"/>
-              <w:rPr>
-                <w:rFonts w:ascii="Helvetica" w:hAnsi="Helvetica" w:eastAsia="Helvetica" w:cs="Helvetica"/>
-                <w:i w:val="false"/>
-                <w:b w:val="false"/>
-                <w:u w:val="none"/>
-                <w:sz w:val="22"/>
-                <w:szCs w:val="22"/>
-                <w:color w:val="000000"/>
-              </w:rPr>
-            </w:pPr>
-            <w:r>
-              <w:rPr>
-                <w:rFonts w:ascii="Helvetica" w:hAnsi="Helvetica" w:eastAsia="Helvetica" w:cs="Helvetica"/>
-                <w:i w:val="false"/>
-                <w:b w:val="false"/>
-                <w:u w:val="none"/>
-                <w:sz w:val="22"/>
-                <w:szCs w:val="22"/>
-                <w:color w:val="000000"/>
-              </w:rPr>
-              <w:t xml:space="preserve">Geom</w:t>
-            </w:r>
-          </w:p>
-        </w:tc>
-        <w:tc>
-          <w:tcPr>
-            <w:tcBorders>
-              <w:bottom w:val="none" w:sz="0" w:space="0" w:color="000000"/>
-              <w:top w:val="none" w:sz="0" w:space="0" w:color="000000"/>
-              <w:left w:val="none" w:sz="0" w:space="0" w:color="000000"/>
-              <w:right w:val="none" w:sz="0" w:space="0" w:color="000000"/>
-            </w:tcBorders>
-            <w:shd w:val="clear" w:color="auto" w:fill="FFFFFF"/>
-            <w:tcMar>
-              <w:top w:w="0" w:type="dxa"/>
-              <w:bottom w:w="0" w:type="dxa"/>
-              <w:left w:w="0" w:type="dxa"/>
-              <w:right w:w="0" w:type="dxa"/>
-            </w:tcMar>
-            <w:vAlign w:val="center"/>
-          </w:tcPr>
-          <w:p>
-            <w:pPr>
-              <w:pStyle w:val="Normal"/>
               <w:jc w:val="right"/>
               <w:pBdr>
                 <w:bottom w:val="none" w:sz="0" w:space="0" w:color="000000"/>
@@ -999,14 +999,14 @@
                 <w:szCs w:val="22"/>
                 <w:color w:val="000000"/>
               </w:rPr>
-              <w:t xml:space="preserve">20</w:t>
+              <w:t xml:space="preserve">22</w:t>
             </w:r>
           </w:p>
         </w:tc>
       </w:tr>
       <w:tr>
         <w:trPr>
-          <w:trHeight w:val="577" w:hRule="auto"/>
+          <w:trHeight w:val="360" w:hRule="auto"/>
         </w:trPr>
         body 6
         <w:tc>
@@ -1058,7 +1058,7 @@
                 <w:szCs w:val="22"/>
                 <w:color w:val="000000"/>
               </w:rPr>
-              <w:t xml:space="preserve">Geom2</w:t>
+              <w:t xml:space="preserve">Geom (mean: 100 bp)</w:t>
             </w:r>
           </w:p>
         </w:tc>
@@ -1111,7 +1111,7 @@
                 <w:szCs w:val="22"/>
                 <w:color w:val="000000"/>
               </w:rPr>
-              <w:t xml:space="preserve">Geom2</w:t>
+              <w:t xml:space="preserve">Mixture</w:t>
             </w:r>
           </w:p>
         </w:tc>
@@ -1164,14 +1164,14 @@
                 <w:szCs w:val="22"/>
                 <w:color w:val="000000"/>
               </w:rPr>
-              <w:t xml:space="preserve">80</w:t>
+              <w:t xml:space="preserve">0</w:t>
             </w:r>
           </w:p>
         </w:tc>
       </w:tr>
       <w:tr>
         <w:trPr>
-          <w:trHeight w:val="577" w:hRule="auto"/>
+          <w:trHeight w:val="360" w:hRule="auto"/>
         </w:trPr>
         body 7
         <w:tc>
@@ -1223,7 +1223,7 @@
                 <w:szCs w:val="22"/>
                 <w:color w:val="000000"/>
               </w:rPr>
-              <w:t xml:space="preserve">Geom3</w:t>
+              <w:t xml:space="preserve">Geom2 (mean: 21 bp)</w:t>
             </w:r>
           </w:p>
         </w:tc>
@@ -1276,7 +1276,7 @@
                 <w:szCs w:val="22"/>
                 <w:color w:val="000000"/>
               </w:rPr>
-              <w:t xml:space="preserve">Mixture</w:t>
+              <w:t xml:space="preserve">Geom</w:t>
             </w:r>
           </w:p>
         </w:tc>
@@ -1329,14 +1329,14 @@
                 <w:szCs w:val="22"/>
                 <w:color w:val="000000"/>
               </w:rPr>
-              <w:t xml:space="preserve">0</w:t>
+              <w:t xml:space="preserve">23</w:t>
             </w:r>
           </w:p>
         </w:tc>
       </w:tr>
       <w:tr>
         <w:trPr>
-          <w:trHeight w:val="577" w:hRule="auto"/>
+          <w:trHeight w:val="360" w:hRule="auto"/>
         </w:trPr>
         body 8
         <w:tc>
@@ -1388,7 +1388,7 @@
                 <w:szCs w:val="22"/>
                 <w:color w:val="000000"/>
               </w:rPr>
-              <w:t xml:space="preserve">Geom3</w:t>
+              <w:t xml:space="preserve">Geom2 (mean: 21 bp)</w:t>
             </w:r>
           </w:p>
         </w:tc>
@@ -1441,7 +1441,7 @@
                 <w:szCs w:val="22"/>
                 <w:color w:val="000000"/>
               </w:rPr>
-              <w:t xml:space="preserve">Geom</w:t>
+              <w:t xml:space="preserve">Geom2</w:t>
             </w:r>
           </w:p>
         </w:tc>
@@ -1494,14 +1494,14 @@
                 <w:szCs w:val="22"/>
                 <w:color w:val="000000"/>
               </w:rPr>
-              <w:t xml:space="preserve">9</w:t>
+              <w:t xml:space="preserve">77</w:t>
             </w:r>
           </w:p>
         </w:tc>
       </w:tr>
       <w:tr>
         <w:trPr>
-          <w:trHeight w:val="577" w:hRule="auto"/>
+          <w:trHeight w:val="360" w:hRule="auto"/>
         </w:trPr>
         body 9
         <w:tc>
@@ -1553,7 +1553,7 @@
                 <w:szCs w:val="22"/>
                 <w:color w:val="000000"/>
               </w:rPr>
-              <w:t xml:space="preserve">Geom3</w:t>
+              <w:t xml:space="preserve">Geom2 (mean: 21 bp)</w:t>
             </w:r>
           </w:p>
         </w:tc>
@@ -1606,7 +1606,7 @@
                 <w:szCs w:val="22"/>
                 <w:color w:val="000000"/>
               </w:rPr>
-              <w:t xml:space="preserve">Geom2</w:t>
+              <w:t xml:space="preserve">Mixture</w:t>
             </w:r>
           </w:p>
         </w:tc>
@@ -1659,14 +1659,14 @@
                 <w:szCs w:val="22"/>
                 <w:color w:val="000000"/>
               </w:rPr>
-              <w:t xml:space="preserve">91</w:t>
+              <w:t xml:space="preserve">0</w:t>
             </w:r>
           </w:p>
         </w:tc>
       </w:tr>
       <w:tr>
         <w:trPr>
-          <w:trHeight w:val="573" w:hRule="auto"/>
+          <w:trHeight w:val="360" w:hRule="auto"/>
         </w:trPr>
         body10
         <w:tc>
@@ -1718,7 +1718,7 @@
                 <w:szCs w:val="22"/>
                 <w:color w:val="000000"/>
               </w:rPr>
-              <w:t xml:space="preserve">Mixture</w:t>
+              <w:t xml:space="preserve">Geom2 (mean: 100 bp)</w:t>
             </w:r>
           </w:p>
         </w:tc>
@@ -1771,7 +1771,7 @@
                 <w:szCs w:val="22"/>
                 <w:color w:val="000000"/>
               </w:rPr>
-              <w:t xml:space="preserve">Mixture</w:t>
+              <w:t xml:space="preserve">Geom</w:t>
             </w:r>
           </w:p>
         </w:tc>
@@ -1824,14 +1824,14 @@
                 <w:szCs w:val="22"/>
                 <w:color w:val="000000"/>
               </w:rPr>
-              <w:t xml:space="preserve">100</w:t>
+              <w:t xml:space="preserve">3</w:t>
             </w:r>
           </w:p>
         </w:tc>
       </w:tr>
       <w:tr>
         <w:trPr>
-          <w:trHeight w:val="577" w:hRule="auto"/>
+          <w:trHeight w:val="360" w:hRule="auto"/>
         </w:trPr>
         body11
         <w:tc>
@@ -1883,7 +1883,7 @@
                 <w:szCs w:val="22"/>
                 <w:color w:val="000000"/>
               </w:rPr>
-              <w:t xml:space="preserve">Mixture</w:t>
+              <w:t xml:space="preserve">Geom2 (mean: 100 bp)</w:t>
             </w:r>
           </w:p>
         </w:tc>
@@ -1936,7 +1936,7 @@
                 <w:szCs w:val="22"/>
                 <w:color w:val="000000"/>
               </w:rPr>
-              <w:t xml:space="preserve">Geom</w:t>
+              <w:t xml:space="preserve">Geom2</w:t>
             </w:r>
           </w:p>
         </w:tc>
@@ -1989,14 +1989,14 @@
                 <w:szCs w:val="22"/>
                 <w:color w:val="000000"/>
               </w:rPr>
-              <w:t xml:space="preserve">0</w:t>
+              <w:t xml:space="preserve">97</w:t>
             </w:r>
           </w:p>
         </w:tc>
       </w:tr>
       <w:tr>
         <w:trPr>
-          <w:trHeight w:val="577" w:hRule="auto"/>
+          <w:trHeight w:val="360" w:hRule="auto"/>
         </w:trPr>
         body12
         <w:tc>
@@ -2048,60 +2048,60 @@
                 <w:szCs w:val="22"/>
                 <w:color w:val="000000"/>
               </w:rPr>
+              <w:t xml:space="preserve">Geom2 (mean: 100 bp)</w:t>
+            </w:r>
+          </w:p>
+        </w:tc>
+        <w:tc>
+          <w:tcPr>
+            <w:tcBorders>
+              <w:bottom w:val="none" w:sz="0" w:space="0" w:color="000000"/>
+              <w:top w:val="none" w:sz="0" w:space="0" w:color="000000"/>
+              <w:left w:val="none" w:sz="0" w:space="0" w:color="000000"/>
+              <w:right w:val="none" w:sz="0" w:space="0" w:color="000000"/>
+            </w:tcBorders>
+            <w:shd w:val="clear" w:color="auto" w:fill="FFFFFF"/>
+            <w:tcMar>
+              <w:top w:w="0" w:type="dxa"/>
+              <w:bottom w:w="0" w:type="dxa"/>
+              <w:left w:w="0" w:type="dxa"/>
+              <w:right w:w="0" w:type="dxa"/>
+            </w:tcMar>
+            <w:vAlign w:val="center"/>
+          </w:tcPr>
+          <w:p>
+            <w:pPr>
+              <w:pStyle w:val="Normal"/>
+              <w:jc w:val="left"/>
+              <w:pBdr>
+                <w:bottom w:val="none" w:sz="0" w:space="0" w:color="000000"/>
+                <w:top w:val="none" w:sz="0" w:space="0" w:color="000000"/>
+                <w:left w:val="none" w:sz="0" w:space="0" w:color="000000"/>
+                <w:right w:val="none" w:sz="0" w:space="0" w:color="000000"/>
+              </w:pBdr>
+              <w:spacing w:after="100" w:before="100" w:line="240"/>
+              <w:ind w:left="100" w:right="100" w:firstLine="0" w:firstLineChars="0"/>
+              <w:rPr>
+                <w:rFonts w:ascii="Helvetica" w:hAnsi="Helvetica" w:eastAsia="Helvetica" w:cs="Helvetica"/>
+                <w:i w:val="false"/>
+                <w:b w:val="false"/>
+                <w:u w:val="none"/>
+                <w:sz w:val="22"/>
+                <w:szCs w:val="22"/>
+                <w:color w:val="000000"/>
+              </w:rPr>
+            </w:pPr>
+            <w:r>
+              <w:rPr>
+                <w:rFonts w:ascii="Helvetica" w:hAnsi="Helvetica" w:eastAsia="Helvetica" w:cs="Helvetica"/>
+                <w:i w:val="false"/>
+                <w:b w:val="false"/>
+                <w:u w:val="none"/>
+                <w:sz w:val="22"/>
+                <w:szCs w:val="22"/>
+                <w:color w:val="000000"/>
+              </w:rPr>
               <w:t xml:space="preserve">Mixture</w:t>
-            </w:r>
-          </w:p>
-        </w:tc>
-        <w:tc>
-          <w:tcPr>
-            <w:tcBorders>
-              <w:bottom w:val="none" w:sz="0" w:space="0" w:color="000000"/>
-              <w:top w:val="none" w:sz="0" w:space="0" w:color="000000"/>
-              <w:left w:val="none" w:sz="0" w:space="0" w:color="000000"/>
-              <w:right w:val="none" w:sz="0" w:space="0" w:color="000000"/>
-            </w:tcBorders>
-            <w:shd w:val="clear" w:color="auto" w:fill="FFFFFF"/>
-            <w:tcMar>
-              <w:top w:w="0" w:type="dxa"/>
-              <w:bottom w:w="0" w:type="dxa"/>
-              <w:left w:w="0" w:type="dxa"/>
-              <w:right w:w="0" w:type="dxa"/>
-            </w:tcMar>
-            <w:vAlign w:val="center"/>
-          </w:tcPr>
-          <w:p>
-            <w:pPr>
-              <w:pStyle w:val="Normal"/>
-              <w:jc w:val="left"/>
-              <w:pBdr>
-                <w:bottom w:val="none" w:sz="0" w:space="0" w:color="000000"/>
-                <w:top w:val="none" w:sz="0" w:space="0" w:color="000000"/>
-                <w:left w:val="none" w:sz="0" w:space="0" w:color="000000"/>
-                <w:right w:val="none" w:sz="0" w:space="0" w:color="000000"/>
-              </w:pBdr>
-              <w:spacing w:after="100" w:before="100" w:line="240"/>
-              <w:ind w:left="100" w:right="100" w:firstLine="0" w:firstLineChars="0"/>
-              <w:rPr>
-                <w:rFonts w:ascii="Helvetica" w:hAnsi="Helvetica" w:eastAsia="Helvetica" w:cs="Helvetica"/>
-                <w:i w:val="false"/>
-                <w:b w:val="false"/>
-                <w:u w:val="none"/>
-                <w:sz w:val="22"/>
-                <w:szCs w:val="22"/>
-                <w:color w:val="000000"/>
-              </w:rPr>
-            </w:pPr>
-            <w:r>
-              <w:rPr>
-                <w:rFonts w:ascii="Helvetica" w:hAnsi="Helvetica" w:eastAsia="Helvetica" w:cs="Helvetica"/>
-                <w:i w:val="false"/>
-                <w:b w:val="false"/>
-                <w:u w:val="none"/>
-                <w:sz w:val="22"/>
-                <w:szCs w:val="22"/>
-                <w:color w:val="000000"/>
-              </w:rPr>
-              <w:t xml:space="preserve">Geom2</w:t>
             </w:r>
           </w:p>
         </w:tc>
@@ -2161,7 +2161,7 @@
       </w:tr>
       <w:tr>
         <w:trPr>
-          <w:trHeight w:val="575" w:hRule="auto"/>
+          <w:trHeight w:val="360" w:hRule="auto"/>
         </w:trPr>
         body13
         <w:tc>
@@ -2213,7 +2213,7 @@
                 <w:szCs w:val="22"/>
                 <w:color w:val="000000"/>
               </w:rPr>
-              <w:t xml:space="preserve">Unif</w:t>
+              <w:t xml:space="preserve">Geom3 (mean: 21 bp)</w:t>
             </w:r>
           </w:p>
         </w:tc>
@@ -2266,7 +2266,7 @@
                 <w:szCs w:val="22"/>
                 <w:color w:val="000000"/>
               </w:rPr>
-              <w:t xml:space="preserve">Mixture</w:t>
+              <w:t xml:space="preserve">Geom</w:t>
             </w:r>
           </w:p>
         </w:tc>
@@ -2319,14 +2319,14 @@
                 <w:szCs w:val="22"/>
                 <w:color w:val="000000"/>
               </w:rPr>
-              <w:t xml:space="preserve">0</w:t>
+              <w:t xml:space="preserve">12</w:t>
             </w:r>
           </w:p>
         </w:tc>
       </w:tr>
       <w:tr>
         <w:trPr>
-          <w:trHeight w:val="577" w:hRule="auto"/>
+          <w:trHeight w:val="360" w:hRule="auto"/>
         </w:trPr>
         body14
         <w:tc>
@@ -2378,7 +2378,7 @@
                 <w:szCs w:val="22"/>
                 <w:color w:val="000000"/>
               </w:rPr>
-              <w:t xml:space="preserve">Unif</w:t>
+              <w:t xml:space="preserve">Geom3 (mean: 21 bp)</w:t>
             </w:r>
           </w:p>
         </w:tc>
@@ -2431,7 +2431,7 @@
                 <w:szCs w:val="22"/>
                 <w:color w:val="000000"/>
               </w:rPr>
-              <w:t xml:space="preserve">Geom</w:t>
+              <w:t xml:space="preserve">Geom2</w:t>
             </w:r>
           </w:p>
         </w:tc>
@@ -2484,19 +2484,2494 @@
                 <w:szCs w:val="22"/>
                 <w:color w:val="000000"/>
               </w:rPr>
-              <w:t xml:space="preserve">0</w:t>
+              <w:t xml:space="preserve">88</w:t>
             </w:r>
           </w:p>
         </w:tc>
       </w:tr>
       <w:tr>
         <w:trPr>
-          <w:trHeight w:val="577" w:hRule="auto"/>
+          <w:trHeight w:val="360" w:hRule="auto"/>
         </w:trPr>
         body15
         <w:tc>
           <w:tcPr>
             <w:tcBorders>
+              <w:bottom w:val="none" w:sz="0" w:space="0" w:color="000000"/>
+              <w:top w:val="none" w:sz="0" w:space="0" w:color="000000"/>
+              <w:left w:val="none" w:sz="0" w:space="0" w:color="000000"/>
+              <w:right w:val="none" w:sz="0" w:space="0" w:color="000000"/>
+            </w:tcBorders>
+            <w:shd w:val="clear" w:color="auto" w:fill="FFFFFF"/>
+            <w:tcMar>
+              <w:top w:w="0" w:type="dxa"/>
+              <w:bottom w:w="0" w:type="dxa"/>
+              <w:left w:w="0" w:type="dxa"/>
+              <w:right w:w="0" w:type="dxa"/>
+            </w:tcMar>
+            <w:vAlign w:val="center"/>
+          </w:tcPr>
+          <w:p>
+            <w:pPr>
+              <w:pStyle w:val="Normal"/>
+              <w:jc w:val="left"/>
+              <w:pBdr>
+                <w:bottom w:val="none" w:sz="0" w:space="0" w:color="000000"/>
+                <w:top w:val="none" w:sz="0" w:space="0" w:color="000000"/>
+                <w:left w:val="none" w:sz="0" w:space="0" w:color="000000"/>
+                <w:right w:val="none" w:sz="0" w:space="0" w:color="000000"/>
+              </w:pBdr>
+              <w:spacing w:after="100" w:before="100" w:line="240"/>
+              <w:ind w:left="100" w:right="100" w:firstLine="0" w:firstLineChars="0"/>
+              <w:rPr>
+                <w:rFonts w:ascii="Helvetica" w:hAnsi="Helvetica" w:eastAsia="Helvetica" w:cs="Helvetica"/>
+                <w:i w:val="false"/>
+                <w:b w:val="false"/>
+                <w:u w:val="none"/>
+                <w:sz w:val="22"/>
+                <w:szCs w:val="22"/>
+                <w:color w:val="000000"/>
+              </w:rPr>
+            </w:pPr>
+            <w:r>
+              <w:rPr>
+                <w:rFonts w:ascii="Helvetica" w:hAnsi="Helvetica" w:eastAsia="Helvetica" w:cs="Helvetica"/>
+                <w:i w:val="false"/>
+                <w:b w:val="false"/>
+                <w:u w:val="none"/>
+                <w:sz w:val="22"/>
+                <w:szCs w:val="22"/>
+                <w:color w:val="000000"/>
+              </w:rPr>
+              <w:t xml:space="preserve">Geom3 (mean: 21 bp)</w:t>
+            </w:r>
+          </w:p>
+        </w:tc>
+        <w:tc>
+          <w:tcPr>
+            <w:tcBorders>
+              <w:bottom w:val="none" w:sz="0" w:space="0" w:color="000000"/>
+              <w:top w:val="none" w:sz="0" w:space="0" w:color="000000"/>
+              <w:left w:val="none" w:sz="0" w:space="0" w:color="000000"/>
+              <w:right w:val="none" w:sz="0" w:space="0" w:color="000000"/>
+            </w:tcBorders>
+            <w:shd w:val="clear" w:color="auto" w:fill="FFFFFF"/>
+            <w:tcMar>
+              <w:top w:w="0" w:type="dxa"/>
+              <w:bottom w:w="0" w:type="dxa"/>
+              <w:left w:w="0" w:type="dxa"/>
+              <w:right w:w="0" w:type="dxa"/>
+            </w:tcMar>
+            <w:vAlign w:val="center"/>
+          </w:tcPr>
+          <w:p>
+            <w:pPr>
+              <w:pStyle w:val="Normal"/>
+              <w:jc w:val="left"/>
+              <w:pBdr>
+                <w:bottom w:val="none" w:sz="0" w:space="0" w:color="000000"/>
+                <w:top w:val="none" w:sz="0" w:space="0" w:color="000000"/>
+                <w:left w:val="none" w:sz="0" w:space="0" w:color="000000"/>
+                <w:right w:val="none" w:sz="0" w:space="0" w:color="000000"/>
+              </w:pBdr>
+              <w:spacing w:after="100" w:before="100" w:line="240"/>
+              <w:ind w:left="100" w:right="100" w:firstLine="0" w:firstLineChars="0"/>
+              <w:rPr>
+                <w:rFonts w:ascii="Helvetica" w:hAnsi="Helvetica" w:eastAsia="Helvetica" w:cs="Helvetica"/>
+                <w:i w:val="false"/>
+                <w:b w:val="false"/>
+                <w:u w:val="none"/>
+                <w:sz w:val="22"/>
+                <w:szCs w:val="22"/>
+                <w:color w:val="000000"/>
+              </w:rPr>
+            </w:pPr>
+            <w:r>
+              <w:rPr>
+                <w:rFonts w:ascii="Helvetica" w:hAnsi="Helvetica" w:eastAsia="Helvetica" w:cs="Helvetica"/>
+                <w:i w:val="false"/>
+                <w:b w:val="false"/>
+                <w:u w:val="none"/>
+                <w:sz w:val="22"/>
+                <w:szCs w:val="22"/>
+                <w:color w:val="000000"/>
+              </w:rPr>
+              <w:t xml:space="preserve">Mixture</w:t>
+            </w:r>
+          </w:p>
+        </w:tc>
+        <w:tc>
+          <w:tcPr>
+            <w:tcBorders>
+              <w:bottom w:val="none" w:sz="0" w:space="0" w:color="000000"/>
+              <w:top w:val="none" w:sz="0" w:space="0" w:color="000000"/>
+              <w:left w:val="none" w:sz="0" w:space="0" w:color="000000"/>
+              <w:right w:val="none" w:sz="0" w:space="0" w:color="000000"/>
+            </w:tcBorders>
+            <w:shd w:val="clear" w:color="auto" w:fill="FFFFFF"/>
+            <w:tcMar>
+              <w:top w:w="0" w:type="dxa"/>
+              <w:bottom w:w="0" w:type="dxa"/>
+              <w:left w:w="0" w:type="dxa"/>
+              <w:right w:w="0" w:type="dxa"/>
+            </w:tcMar>
+            <w:vAlign w:val="center"/>
+          </w:tcPr>
+          <w:p>
+            <w:pPr>
+              <w:pStyle w:val="Normal"/>
+              <w:jc w:val="right"/>
+              <w:pBdr>
+                <w:bottom w:val="none" w:sz="0" w:space="0" w:color="000000"/>
+                <w:top w:val="none" w:sz="0" w:space="0" w:color="000000"/>
+                <w:left w:val="none" w:sz="0" w:space="0" w:color="000000"/>
+                <w:right w:val="none" w:sz="0" w:space="0" w:color="000000"/>
+              </w:pBdr>
+              <w:spacing w:after="100" w:before="100" w:line="240"/>
+              <w:ind w:left="100" w:right="100" w:firstLine="0" w:firstLineChars="0"/>
+              <w:rPr>
+                <w:rFonts w:ascii="Helvetica" w:hAnsi="Helvetica" w:eastAsia="Helvetica" w:cs="Helvetica"/>
+                <w:i w:val="false"/>
+                <w:b w:val="false"/>
+                <w:u w:val="none"/>
+                <w:sz w:val="22"/>
+                <w:szCs w:val="22"/>
+                <w:color w:val="000000"/>
+              </w:rPr>
+            </w:pPr>
+            <w:r>
+              <w:rPr>
+                <w:rFonts w:ascii="Helvetica" w:hAnsi="Helvetica" w:eastAsia="Helvetica" w:cs="Helvetica"/>
+                <w:i w:val="false"/>
+                <w:b w:val="false"/>
+                <w:u w:val="none"/>
+                <w:sz w:val="22"/>
+                <w:szCs w:val="22"/>
+                <w:color w:val="000000"/>
+              </w:rPr>
+              <w:t xml:space="preserve">0</w:t>
+            </w:r>
+          </w:p>
+        </w:tc>
+      </w:tr>
+      <w:tr>
+        <w:trPr>
+          <w:trHeight w:val="360" w:hRule="auto"/>
+        </w:trPr>
+        body16
+        <w:tc>
+          <w:tcPr>
+            <w:tcBorders>
+              <w:bottom w:val="none" w:sz="0" w:space="0" w:color="000000"/>
+              <w:top w:val="none" w:sz="0" w:space="0" w:color="000000"/>
+              <w:left w:val="none" w:sz="0" w:space="0" w:color="000000"/>
+              <w:right w:val="none" w:sz="0" w:space="0" w:color="000000"/>
+            </w:tcBorders>
+            <w:shd w:val="clear" w:color="auto" w:fill="FFFFFF"/>
+            <w:tcMar>
+              <w:top w:w="0" w:type="dxa"/>
+              <w:bottom w:w="0" w:type="dxa"/>
+              <w:left w:w="0" w:type="dxa"/>
+              <w:right w:w="0" w:type="dxa"/>
+            </w:tcMar>
+            <w:vAlign w:val="center"/>
+          </w:tcPr>
+          <w:p>
+            <w:pPr>
+              <w:pStyle w:val="Normal"/>
+              <w:jc w:val="left"/>
+              <w:pBdr>
+                <w:bottom w:val="none" w:sz="0" w:space="0" w:color="000000"/>
+                <w:top w:val="none" w:sz="0" w:space="0" w:color="000000"/>
+                <w:left w:val="none" w:sz="0" w:space="0" w:color="000000"/>
+                <w:right w:val="none" w:sz="0" w:space="0" w:color="000000"/>
+              </w:pBdr>
+              <w:spacing w:after="100" w:before="100" w:line="240"/>
+              <w:ind w:left="100" w:right="100" w:firstLine="0" w:firstLineChars="0"/>
+              <w:rPr>
+                <w:rFonts w:ascii="Helvetica" w:hAnsi="Helvetica" w:eastAsia="Helvetica" w:cs="Helvetica"/>
+                <w:i w:val="false"/>
+                <w:b w:val="false"/>
+                <w:u w:val="none"/>
+                <w:sz w:val="22"/>
+                <w:szCs w:val="22"/>
+                <w:color w:val="000000"/>
+              </w:rPr>
+            </w:pPr>
+            <w:r>
+              <w:rPr>
+                <w:rFonts w:ascii="Helvetica" w:hAnsi="Helvetica" w:eastAsia="Helvetica" w:cs="Helvetica"/>
+                <w:i w:val="false"/>
+                <w:b w:val="false"/>
+                <w:u w:val="none"/>
+                <w:sz w:val="22"/>
+                <w:szCs w:val="22"/>
+                <w:color w:val="000000"/>
+              </w:rPr>
+              <w:t xml:space="preserve">Geom3 (mean: 100 bp)</w:t>
+            </w:r>
+          </w:p>
+        </w:tc>
+        <w:tc>
+          <w:tcPr>
+            <w:tcBorders>
+              <w:bottom w:val="none" w:sz="0" w:space="0" w:color="000000"/>
+              <w:top w:val="none" w:sz="0" w:space="0" w:color="000000"/>
+              <w:left w:val="none" w:sz="0" w:space="0" w:color="000000"/>
+              <w:right w:val="none" w:sz="0" w:space="0" w:color="000000"/>
+            </w:tcBorders>
+            <w:shd w:val="clear" w:color="auto" w:fill="FFFFFF"/>
+            <w:tcMar>
+              <w:top w:w="0" w:type="dxa"/>
+              <w:bottom w:w="0" w:type="dxa"/>
+              <w:left w:w="0" w:type="dxa"/>
+              <w:right w:w="0" w:type="dxa"/>
+            </w:tcMar>
+            <w:vAlign w:val="center"/>
+          </w:tcPr>
+          <w:p>
+            <w:pPr>
+              <w:pStyle w:val="Normal"/>
+              <w:jc w:val="left"/>
+              <w:pBdr>
+                <w:bottom w:val="none" w:sz="0" w:space="0" w:color="000000"/>
+                <w:top w:val="none" w:sz="0" w:space="0" w:color="000000"/>
+                <w:left w:val="none" w:sz="0" w:space="0" w:color="000000"/>
+                <w:right w:val="none" w:sz="0" w:space="0" w:color="000000"/>
+              </w:pBdr>
+              <w:spacing w:after="100" w:before="100" w:line="240"/>
+              <w:ind w:left="100" w:right="100" w:firstLine="0" w:firstLineChars="0"/>
+              <w:rPr>
+                <w:rFonts w:ascii="Helvetica" w:hAnsi="Helvetica" w:eastAsia="Helvetica" w:cs="Helvetica"/>
+                <w:i w:val="false"/>
+                <w:b w:val="false"/>
+                <w:u w:val="none"/>
+                <w:sz w:val="22"/>
+                <w:szCs w:val="22"/>
+                <w:color w:val="000000"/>
+              </w:rPr>
+            </w:pPr>
+            <w:r>
+              <w:rPr>
+                <w:rFonts w:ascii="Helvetica" w:hAnsi="Helvetica" w:eastAsia="Helvetica" w:cs="Helvetica"/>
+                <w:i w:val="false"/>
+                <w:b w:val="false"/>
+                <w:u w:val="none"/>
+                <w:sz w:val="22"/>
+                <w:szCs w:val="22"/>
+                <w:color w:val="000000"/>
+              </w:rPr>
+              <w:t xml:space="preserve">Geom</w:t>
+            </w:r>
+          </w:p>
+        </w:tc>
+        <w:tc>
+          <w:tcPr>
+            <w:tcBorders>
+              <w:bottom w:val="none" w:sz="0" w:space="0" w:color="000000"/>
+              <w:top w:val="none" w:sz="0" w:space="0" w:color="000000"/>
+              <w:left w:val="none" w:sz="0" w:space="0" w:color="000000"/>
+              <w:right w:val="none" w:sz="0" w:space="0" w:color="000000"/>
+            </w:tcBorders>
+            <w:shd w:val="clear" w:color="auto" w:fill="FFFFFF"/>
+            <w:tcMar>
+              <w:top w:w="0" w:type="dxa"/>
+              <w:bottom w:w="0" w:type="dxa"/>
+              <w:left w:w="0" w:type="dxa"/>
+              <w:right w:w="0" w:type="dxa"/>
+            </w:tcMar>
+            <w:vAlign w:val="center"/>
+          </w:tcPr>
+          <w:p>
+            <w:pPr>
+              <w:pStyle w:val="Normal"/>
+              <w:jc w:val="right"/>
+              <w:pBdr>
+                <w:bottom w:val="none" w:sz="0" w:space="0" w:color="000000"/>
+                <w:top w:val="none" w:sz="0" w:space="0" w:color="000000"/>
+                <w:left w:val="none" w:sz="0" w:space="0" w:color="000000"/>
+                <w:right w:val="none" w:sz="0" w:space="0" w:color="000000"/>
+              </w:pBdr>
+              <w:spacing w:after="100" w:before="100" w:line="240"/>
+              <w:ind w:left="100" w:right="100" w:firstLine="0" w:firstLineChars="0"/>
+              <w:rPr>
+                <w:rFonts w:ascii="Helvetica" w:hAnsi="Helvetica" w:eastAsia="Helvetica" w:cs="Helvetica"/>
+                <w:i w:val="false"/>
+                <w:b w:val="false"/>
+                <w:u w:val="none"/>
+                <w:sz w:val="22"/>
+                <w:szCs w:val="22"/>
+                <w:color w:val="000000"/>
+              </w:rPr>
+            </w:pPr>
+            <w:r>
+              <w:rPr>
+                <w:rFonts w:ascii="Helvetica" w:hAnsi="Helvetica" w:eastAsia="Helvetica" w:cs="Helvetica"/>
+                <w:i w:val="false"/>
+                <w:b w:val="false"/>
+                <w:u w:val="none"/>
+                <w:sz w:val="22"/>
+                <w:szCs w:val="22"/>
+                <w:color w:val="000000"/>
+              </w:rPr>
+              <w:t xml:space="preserve">0</w:t>
+            </w:r>
+          </w:p>
+        </w:tc>
+      </w:tr>
+      <w:tr>
+        <w:trPr>
+          <w:trHeight w:val="360" w:hRule="auto"/>
+        </w:trPr>
+        body17
+        <w:tc>
+          <w:tcPr>
+            <w:tcBorders>
+              <w:bottom w:val="none" w:sz="0" w:space="0" w:color="000000"/>
+              <w:top w:val="none" w:sz="0" w:space="0" w:color="000000"/>
+              <w:left w:val="none" w:sz="0" w:space="0" w:color="000000"/>
+              <w:right w:val="none" w:sz="0" w:space="0" w:color="000000"/>
+            </w:tcBorders>
+            <w:shd w:val="clear" w:color="auto" w:fill="FFFFFF"/>
+            <w:tcMar>
+              <w:top w:w="0" w:type="dxa"/>
+              <w:bottom w:w="0" w:type="dxa"/>
+              <w:left w:w="0" w:type="dxa"/>
+              <w:right w:w="0" w:type="dxa"/>
+            </w:tcMar>
+            <w:vAlign w:val="center"/>
+          </w:tcPr>
+          <w:p>
+            <w:pPr>
+              <w:pStyle w:val="Normal"/>
+              <w:jc w:val="left"/>
+              <w:pBdr>
+                <w:bottom w:val="none" w:sz="0" w:space="0" w:color="000000"/>
+                <w:top w:val="none" w:sz="0" w:space="0" w:color="000000"/>
+                <w:left w:val="none" w:sz="0" w:space="0" w:color="000000"/>
+                <w:right w:val="none" w:sz="0" w:space="0" w:color="000000"/>
+              </w:pBdr>
+              <w:spacing w:after="100" w:before="100" w:line="240"/>
+              <w:ind w:left="100" w:right="100" w:firstLine="0" w:firstLineChars="0"/>
+              <w:rPr>
+                <w:rFonts w:ascii="Helvetica" w:hAnsi="Helvetica" w:eastAsia="Helvetica" w:cs="Helvetica"/>
+                <w:i w:val="false"/>
+                <w:b w:val="false"/>
+                <w:u w:val="none"/>
+                <w:sz w:val="22"/>
+                <w:szCs w:val="22"/>
+                <w:color w:val="000000"/>
+              </w:rPr>
+            </w:pPr>
+            <w:r>
+              <w:rPr>
+                <w:rFonts w:ascii="Helvetica" w:hAnsi="Helvetica" w:eastAsia="Helvetica" w:cs="Helvetica"/>
+                <w:i w:val="false"/>
+                <w:b w:val="false"/>
+                <w:u w:val="none"/>
+                <w:sz w:val="22"/>
+                <w:szCs w:val="22"/>
+                <w:color w:val="000000"/>
+              </w:rPr>
+              <w:t xml:space="preserve">Geom3 (mean: 100 bp)</w:t>
+            </w:r>
+          </w:p>
+        </w:tc>
+        <w:tc>
+          <w:tcPr>
+            <w:tcBorders>
+              <w:bottom w:val="none" w:sz="0" w:space="0" w:color="000000"/>
+              <w:top w:val="none" w:sz="0" w:space="0" w:color="000000"/>
+              <w:left w:val="none" w:sz="0" w:space="0" w:color="000000"/>
+              <w:right w:val="none" w:sz="0" w:space="0" w:color="000000"/>
+            </w:tcBorders>
+            <w:shd w:val="clear" w:color="auto" w:fill="FFFFFF"/>
+            <w:tcMar>
+              <w:top w:w="0" w:type="dxa"/>
+              <w:bottom w:w="0" w:type="dxa"/>
+              <w:left w:w="0" w:type="dxa"/>
+              <w:right w:w="0" w:type="dxa"/>
+            </w:tcMar>
+            <w:vAlign w:val="center"/>
+          </w:tcPr>
+          <w:p>
+            <w:pPr>
+              <w:pStyle w:val="Normal"/>
+              <w:jc w:val="left"/>
+              <w:pBdr>
+                <w:bottom w:val="none" w:sz="0" w:space="0" w:color="000000"/>
+                <w:top w:val="none" w:sz="0" w:space="0" w:color="000000"/>
+                <w:left w:val="none" w:sz="0" w:space="0" w:color="000000"/>
+                <w:right w:val="none" w:sz="0" w:space="0" w:color="000000"/>
+              </w:pBdr>
+              <w:spacing w:after="100" w:before="100" w:line="240"/>
+              <w:ind w:left="100" w:right="100" w:firstLine="0" w:firstLineChars="0"/>
+              <w:rPr>
+                <w:rFonts w:ascii="Helvetica" w:hAnsi="Helvetica" w:eastAsia="Helvetica" w:cs="Helvetica"/>
+                <w:i w:val="false"/>
+                <w:b w:val="false"/>
+                <w:u w:val="none"/>
+                <w:sz w:val="22"/>
+                <w:szCs w:val="22"/>
+                <w:color w:val="000000"/>
+              </w:rPr>
+            </w:pPr>
+            <w:r>
+              <w:rPr>
+                <w:rFonts w:ascii="Helvetica" w:hAnsi="Helvetica" w:eastAsia="Helvetica" w:cs="Helvetica"/>
+                <w:i w:val="false"/>
+                <w:b w:val="false"/>
+                <w:u w:val="none"/>
+                <w:sz w:val="22"/>
+                <w:szCs w:val="22"/>
+                <w:color w:val="000000"/>
+              </w:rPr>
+              <w:t xml:space="preserve">Geom2</w:t>
+            </w:r>
+          </w:p>
+        </w:tc>
+        <w:tc>
+          <w:tcPr>
+            <w:tcBorders>
+              <w:bottom w:val="none" w:sz="0" w:space="0" w:color="000000"/>
+              <w:top w:val="none" w:sz="0" w:space="0" w:color="000000"/>
+              <w:left w:val="none" w:sz="0" w:space="0" w:color="000000"/>
+              <w:right w:val="none" w:sz="0" w:space="0" w:color="000000"/>
+            </w:tcBorders>
+            <w:shd w:val="clear" w:color="auto" w:fill="FFFFFF"/>
+            <w:tcMar>
+              <w:top w:w="0" w:type="dxa"/>
+              <w:bottom w:w="0" w:type="dxa"/>
+              <w:left w:w="0" w:type="dxa"/>
+              <w:right w:w="0" w:type="dxa"/>
+            </w:tcMar>
+            <w:vAlign w:val="center"/>
+          </w:tcPr>
+          <w:p>
+            <w:pPr>
+              <w:pStyle w:val="Normal"/>
+              <w:jc w:val="right"/>
+              <w:pBdr>
+                <w:bottom w:val="none" w:sz="0" w:space="0" w:color="000000"/>
+                <w:top w:val="none" w:sz="0" w:space="0" w:color="000000"/>
+                <w:left w:val="none" w:sz="0" w:space="0" w:color="000000"/>
+                <w:right w:val="none" w:sz="0" w:space="0" w:color="000000"/>
+              </w:pBdr>
+              <w:spacing w:after="100" w:before="100" w:line="240"/>
+              <w:ind w:left="100" w:right="100" w:firstLine="0" w:firstLineChars="0"/>
+              <w:rPr>
+                <w:rFonts w:ascii="Helvetica" w:hAnsi="Helvetica" w:eastAsia="Helvetica" w:cs="Helvetica"/>
+                <w:i w:val="false"/>
+                <w:b w:val="false"/>
+                <w:u w:val="none"/>
+                <w:sz w:val="22"/>
+                <w:szCs w:val="22"/>
+                <w:color w:val="000000"/>
+              </w:rPr>
+            </w:pPr>
+            <w:r>
+              <w:rPr>
+                <w:rFonts w:ascii="Helvetica" w:hAnsi="Helvetica" w:eastAsia="Helvetica" w:cs="Helvetica"/>
+                <w:i w:val="false"/>
+                <w:b w:val="false"/>
+                <w:u w:val="none"/>
+                <w:sz w:val="22"/>
+                <w:szCs w:val="22"/>
+                <w:color w:val="000000"/>
+              </w:rPr>
+              <w:t xml:space="preserve">100</w:t>
+            </w:r>
+          </w:p>
+        </w:tc>
+      </w:tr>
+      <w:tr>
+        <w:trPr>
+          <w:trHeight w:val="360" w:hRule="auto"/>
+        </w:trPr>
+        body18
+        <w:tc>
+          <w:tcPr>
+            <w:tcBorders>
+              <w:bottom w:val="none" w:sz="0" w:space="0" w:color="000000"/>
+              <w:top w:val="none" w:sz="0" w:space="0" w:color="000000"/>
+              <w:left w:val="none" w:sz="0" w:space="0" w:color="000000"/>
+              <w:right w:val="none" w:sz="0" w:space="0" w:color="000000"/>
+            </w:tcBorders>
+            <w:shd w:val="clear" w:color="auto" w:fill="FFFFFF"/>
+            <w:tcMar>
+              <w:top w:w="0" w:type="dxa"/>
+              <w:bottom w:w="0" w:type="dxa"/>
+              <w:left w:w="0" w:type="dxa"/>
+              <w:right w:w="0" w:type="dxa"/>
+            </w:tcMar>
+            <w:vAlign w:val="center"/>
+          </w:tcPr>
+          <w:p>
+            <w:pPr>
+              <w:pStyle w:val="Normal"/>
+              <w:jc w:val="left"/>
+              <w:pBdr>
+                <w:bottom w:val="none" w:sz="0" w:space="0" w:color="000000"/>
+                <w:top w:val="none" w:sz="0" w:space="0" w:color="000000"/>
+                <w:left w:val="none" w:sz="0" w:space="0" w:color="000000"/>
+                <w:right w:val="none" w:sz="0" w:space="0" w:color="000000"/>
+              </w:pBdr>
+              <w:spacing w:after="100" w:before="100" w:line="240"/>
+              <w:ind w:left="100" w:right="100" w:firstLine="0" w:firstLineChars="0"/>
+              <w:rPr>
+                <w:rFonts w:ascii="Helvetica" w:hAnsi="Helvetica" w:eastAsia="Helvetica" w:cs="Helvetica"/>
+                <w:i w:val="false"/>
+                <w:b w:val="false"/>
+                <w:u w:val="none"/>
+                <w:sz w:val="22"/>
+                <w:szCs w:val="22"/>
+                <w:color w:val="000000"/>
+              </w:rPr>
+            </w:pPr>
+            <w:r>
+              <w:rPr>
+                <w:rFonts w:ascii="Helvetica" w:hAnsi="Helvetica" w:eastAsia="Helvetica" w:cs="Helvetica"/>
+                <w:i w:val="false"/>
+                <w:b w:val="false"/>
+                <w:u w:val="none"/>
+                <w:sz w:val="22"/>
+                <w:szCs w:val="22"/>
+                <w:color w:val="000000"/>
+              </w:rPr>
+              <w:t xml:space="preserve">Geom3 (mean: 100 bp)</w:t>
+            </w:r>
+          </w:p>
+        </w:tc>
+        <w:tc>
+          <w:tcPr>
+            <w:tcBorders>
+              <w:bottom w:val="none" w:sz="0" w:space="0" w:color="000000"/>
+              <w:top w:val="none" w:sz="0" w:space="0" w:color="000000"/>
+              <w:left w:val="none" w:sz="0" w:space="0" w:color="000000"/>
+              <w:right w:val="none" w:sz="0" w:space="0" w:color="000000"/>
+            </w:tcBorders>
+            <w:shd w:val="clear" w:color="auto" w:fill="FFFFFF"/>
+            <w:tcMar>
+              <w:top w:w="0" w:type="dxa"/>
+              <w:bottom w:w="0" w:type="dxa"/>
+              <w:left w:w="0" w:type="dxa"/>
+              <w:right w:w="0" w:type="dxa"/>
+            </w:tcMar>
+            <w:vAlign w:val="center"/>
+          </w:tcPr>
+          <w:p>
+            <w:pPr>
+              <w:pStyle w:val="Normal"/>
+              <w:jc w:val="left"/>
+              <w:pBdr>
+                <w:bottom w:val="none" w:sz="0" w:space="0" w:color="000000"/>
+                <w:top w:val="none" w:sz="0" w:space="0" w:color="000000"/>
+                <w:left w:val="none" w:sz="0" w:space="0" w:color="000000"/>
+                <w:right w:val="none" w:sz="0" w:space="0" w:color="000000"/>
+              </w:pBdr>
+              <w:spacing w:after="100" w:before="100" w:line="240"/>
+              <w:ind w:left="100" w:right="100" w:firstLine="0" w:firstLineChars="0"/>
+              <w:rPr>
+                <w:rFonts w:ascii="Helvetica" w:hAnsi="Helvetica" w:eastAsia="Helvetica" w:cs="Helvetica"/>
+                <w:i w:val="false"/>
+                <w:b w:val="false"/>
+                <w:u w:val="none"/>
+                <w:sz w:val="22"/>
+                <w:szCs w:val="22"/>
+                <w:color w:val="000000"/>
+              </w:rPr>
+            </w:pPr>
+            <w:r>
+              <w:rPr>
+                <w:rFonts w:ascii="Helvetica" w:hAnsi="Helvetica" w:eastAsia="Helvetica" w:cs="Helvetica"/>
+                <w:i w:val="false"/>
+                <w:b w:val="false"/>
+                <w:u w:val="none"/>
+                <w:sz w:val="22"/>
+                <w:szCs w:val="22"/>
+                <w:color w:val="000000"/>
+              </w:rPr>
+              <w:t xml:space="preserve">Mixture</w:t>
+            </w:r>
+          </w:p>
+        </w:tc>
+        <w:tc>
+          <w:tcPr>
+            <w:tcBorders>
+              <w:bottom w:val="none" w:sz="0" w:space="0" w:color="000000"/>
+              <w:top w:val="none" w:sz="0" w:space="0" w:color="000000"/>
+              <w:left w:val="none" w:sz="0" w:space="0" w:color="000000"/>
+              <w:right w:val="none" w:sz="0" w:space="0" w:color="000000"/>
+            </w:tcBorders>
+            <w:shd w:val="clear" w:color="auto" w:fill="FFFFFF"/>
+            <w:tcMar>
+              <w:top w:w="0" w:type="dxa"/>
+              <w:bottom w:w="0" w:type="dxa"/>
+              <w:left w:w="0" w:type="dxa"/>
+              <w:right w:w="0" w:type="dxa"/>
+            </w:tcMar>
+            <w:vAlign w:val="center"/>
+          </w:tcPr>
+          <w:p>
+            <w:pPr>
+              <w:pStyle w:val="Normal"/>
+              <w:jc w:val="right"/>
+              <w:pBdr>
+                <w:bottom w:val="none" w:sz="0" w:space="0" w:color="000000"/>
+                <w:top w:val="none" w:sz="0" w:space="0" w:color="000000"/>
+                <w:left w:val="none" w:sz="0" w:space="0" w:color="000000"/>
+                <w:right w:val="none" w:sz="0" w:space="0" w:color="000000"/>
+              </w:pBdr>
+              <w:spacing w:after="100" w:before="100" w:line="240"/>
+              <w:ind w:left="100" w:right="100" w:firstLine="0" w:firstLineChars="0"/>
+              <w:rPr>
+                <w:rFonts w:ascii="Helvetica" w:hAnsi="Helvetica" w:eastAsia="Helvetica" w:cs="Helvetica"/>
+                <w:i w:val="false"/>
+                <w:b w:val="false"/>
+                <w:u w:val="none"/>
+                <w:sz w:val="22"/>
+                <w:szCs w:val="22"/>
+                <w:color w:val="000000"/>
+              </w:rPr>
+            </w:pPr>
+            <w:r>
+              <w:rPr>
+                <w:rFonts w:ascii="Helvetica" w:hAnsi="Helvetica" w:eastAsia="Helvetica" w:cs="Helvetica"/>
+                <w:i w:val="false"/>
+                <w:b w:val="false"/>
+                <w:u w:val="none"/>
+                <w:sz w:val="22"/>
+                <w:szCs w:val="22"/>
+                <w:color w:val="000000"/>
+              </w:rPr>
+              <w:t xml:space="preserve">0</w:t>
+            </w:r>
+          </w:p>
+        </w:tc>
+      </w:tr>
+      <w:tr>
+        <w:trPr>
+          <w:trHeight w:val="360" w:hRule="auto"/>
+        </w:trPr>
+        body19
+        <w:tc>
+          <w:tcPr>
+            <w:tcBorders>
+              <w:bottom w:val="none" w:sz="0" w:space="0" w:color="000000"/>
+              <w:top w:val="none" w:sz="0" w:space="0" w:color="000000"/>
+              <w:left w:val="none" w:sz="0" w:space="0" w:color="000000"/>
+              <w:right w:val="none" w:sz="0" w:space="0" w:color="000000"/>
+            </w:tcBorders>
+            <w:shd w:val="clear" w:color="auto" w:fill="FFFFFF"/>
+            <w:tcMar>
+              <w:top w:w="0" w:type="dxa"/>
+              <w:bottom w:w="0" w:type="dxa"/>
+              <w:left w:w="0" w:type="dxa"/>
+              <w:right w:w="0" w:type="dxa"/>
+            </w:tcMar>
+            <w:vAlign w:val="center"/>
+          </w:tcPr>
+          <w:p>
+            <w:pPr>
+              <w:pStyle w:val="Normal"/>
+              <w:jc w:val="left"/>
+              <w:pBdr>
+                <w:bottom w:val="none" w:sz="0" w:space="0" w:color="000000"/>
+                <w:top w:val="none" w:sz="0" w:space="0" w:color="000000"/>
+                <w:left w:val="none" w:sz="0" w:space="0" w:color="000000"/>
+                <w:right w:val="none" w:sz="0" w:space="0" w:color="000000"/>
+              </w:pBdr>
+              <w:spacing w:after="100" w:before="100" w:line="240"/>
+              <w:ind w:left="100" w:right="100" w:firstLine="0" w:firstLineChars="0"/>
+              <w:rPr>
+                <w:rFonts w:ascii="Helvetica" w:hAnsi="Helvetica" w:eastAsia="Helvetica" w:cs="Helvetica"/>
+                <w:i w:val="false"/>
+                <w:b w:val="false"/>
+                <w:u w:val="none"/>
+                <w:sz w:val="22"/>
+                <w:szCs w:val="22"/>
+                <w:color w:val="000000"/>
+              </w:rPr>
+            </w:pPr>
+            <w:r>
+              <w:rPr>
+                <w:rFonts w:ascii="Helvetica" w:hAnsi="Helvetica" w:eastAsia="Helvetica" w:cs="Helvetica"/>
+                <w:i w:val="false"/>
+                <w:b w:val="false"/>
+                <w:u w:val="none"/>
+                <w:sz w:val="22"/>
+                <w:szCs w:val="22"/>
+                <w:color w:val="000000"/>
+              </w:rPr>
+              <w:t xml:space="preserve">Uniform (mean: 21 bp)</w:t>
+            </w:r>
+          </w:p>
+        </w:tc>
+        <w:tc>
+          <w:tcPr>
+            <w:tcBorders>
+              <w:bottom w:val="none" w:sz="0" w:space="0" w:color="000000"/>
+              <w:top w:val="none" w:sz="0" w:space="0" w:color="000000"/>
+              <w:left w:val="none" w:sz="0" w:space="0" w:color="000000"/>
+              <w:right w:val="none" w:sz="0" w:space="0" w:color="000000"/>
+            </w:tcBorders>
+            <w:shd w:val="clear" w:color="auto" w:fill="FFFFFF"/>
+            <w:tcMar>
+              <w:top w:w="0" w:type="dxa"/>
+              <w:bottom w:w="0" w:type="dxa"/>
+              <w:left w:w="0" w:type="dxa"/>
+              <w:right w:w="0" w:type="dxa"/>
+            </w:tcMar>
+            <w:vAlign w:val="center"/>
+          </w:tcPr>
+          <w:p>
+            <w:pPr>
+              <w:pStyle w:val="Normal"/>
+              <w:jc w:val="left"/>
+              <w:pBdr>
+                <w:bottom w:val="none" w:sz="0" w:space="0" w:color="000000"/>
+                <w:top w:val="none" w:sz="0" w:space="0" w:color="000000"/>
+                <w:left w:val="none" w:sz="0" w:space="0" w:color="000000"/>
+                <w:right w:val="none" w:sz="0" w:space="0" w:color="000000"/>
+              </w:pBdr>
+              <w:spacing w:after="100" w:before="100" w:line="240"/>
+              <w:ind w:left="100" w:right="100" w:firstLine="0" w:firstLineChars="0"/>
+              <w:rPr>
+                <w:rFonts w:ascii="Helvetica" w:hAnsi="Helvetica" w:eastAsia="Helvetica" w:cs="Helvetica"/>
+                <w:i w:val="false"/>
+                <w:b w:val="false"/>
+                <w:u w:val="none"/>
+                <w:sz w:val="22"/>
+                <w:szCs w:val="22"/>
+                <w:color w:val="000000"/>
+              </w:rPr>
+            </w:pPr>
+            <w:r>
+              <w:rPr>
+                <w:rFonts w:ascii="Helvetica" w:hAnsi="Helvetica" w:eastAsia="Helvetica" w:cs="Helvetica"/>
+                <w:i w:val="false"/>
+                <w:b w:val="false"/>
+                <w:u w:val="none"/>
+                <w:sz w:val="22"/>
+                <w:szCs w:val="22"/>
+                <w:color w:val="000000"/>
+              </w:rPr>
+              <w:t xml:space="preserve">Geom</w:t>
+            </w:r>
+          </w:p>
+        </w:tc>
+        <w:tc>
+          <w:tcPr>
+            <w:tcBorders>
+              <w:bottom w:val="none" w:sz="0" w:space="0" w:color="000000"/>
+              <w:top w:val="none" w:sz="0" w:space="0" w:color="000000"/>
+              <w:left w:val="none" w:sz="0" w:space="0" w:color="000000"/>
+              <w:right w:val="none" w:sz="0" w:space="0" w:color="000000"/>
+            </w:tcBorders>
+            <w:shd w:val="clear" w:color="auto" w:fill="FFFFFF"/>
+            <w:tcMar>
+              <w:top w:w="0" w:type="dxa"/>
+              <w:bottom w:w="0" w:type="dxa"/>
+              <w:left w:w="0" w:type="dxa"/>
+              <w:right w:w="0" w:type="dxa"/>
+            </w:tcMar>
+            <w:vAlign w:val="center"/>
+          </w:tcPr>
+          <w:p>
+            <w:pPr>
+              <w:pStyle w:val="Normal"/>
+              <w:jc w:val="right"/>
+              <w:pBdr>
+                <w:bottom w:val="none" w:sz="0" w:space="0" w:color="000000"/>
+                <w:top w:val="none" w:sz="0" w:space="0" w:color="000000"/>
+                <w:left w:val="none" w:sz="0" w:space="0" w:color="000000"/>
+                <w:right w:val="none" w:sz="0" w:space="0" w:color="000000"/>
+              </w:pBdr>
+              <w:spacing w:after="100" w:before="100" w:line="240"/>
+              <w:ind w:left="100" w:right="100" w:firstLine="0" w:firstLineChars="0"/>
+              <w:rPr>
+                <w:rFonts w:ascii="Helvetica" w:hAnsi="Helvetica" w:eastAsia="Helvetica" w:cs="Helvetica"/>
+                <w:i w:val="false"/>
+                <w:b w:val="false"/>
+                <w:u w:val="none"/>
+                <w:sz w:val="22"/>
+                <w:szCs w:val="22"/>
+                <w:color w:val="000000"/>
+              </w:rPr>
+            </w:pPr>
+            <w:r>
+              <w:rPr>
+                <w:rFonts w:ascii="Helvetica" w:hAnsi="Helvetica" w:eastAsia="Helvetica" w:cs="Helvetica"/>
+                <w:i w:val="false"/>
+                <w:b w:val="false"/>
+                <w:u w:val="none"/>
+                <w:sz w:val="22"/>
+                <w:szCs w:val="22"/>
+                <w:color w:val="000000"/>
+              </w:rPr>
+              <w:t xml:space="preserve">1</w:t>
+            </w:r>
+          </w:p>
+        </w:tc>
+      </w:tr>
+      <w:tr>
+        <w:trPr>
+          <w:trHeight w:val="360" w:hRule="auto"/>
+        </w:trPr>
+        body20
+        <w:tc>
+          <w:tcPr>
+            <w:tcBorders>
+              <w:bottom w:val="none" w:sz="0" w:space="0" w:color="000000"/>
+              <w:top w:val="none" w:sz="0" w:space="0" w:color="000000"/>
+              <w:left w:val="none" w:sz="0" w:space="0" w:color="000000"/>
+              <w:right w:val="none" w:sz="0" w:space="0" w:color="000000"/>
+            </w:tcBorders>
+            <w:shd w:val="clear" w:color="auto" w:fill="FFFFFF"/>
+            <w:tcMar>
+              <w:top w:w="0" w:type="dxa"/>
+              <w:bottom w:w="0" w:type="dxa"/>
+              <w:left w:w="0" w:type="dxa"/>
+              <w:right w:w="0" w:type="dxa"/>
+            </w:tcMar>
+            <w:vAlign w:val="center"/>
+          </w:tcPr>
+          <w:p>
+            <w:pPr>
+              <w:pStyle w:val="Normal"/>
+              <w:jc w:val="left"/>
+              <w:pBdr>
+                <w:bottom w:val="none" w:sz="0" w:space="0" w:color="000000"/>
+                <w:top w:val="none" w:sz="0" w:space="0" w:color="000000"/>
+                <w:left w:val="none" w:sz="0" w:space="0" w:color="000000"/>
+                <w:right w:val="none" w:sz="0" w:space="0" w:color="000000"/>
+              </w:pBdr>
+              <w:spacing w:after="100" w:before="100" w:line="240"/>
+              <w:ind w:left="100" w:right="100" w:firstLine="0" w:firstLineChars="0"/>
+              <w:rPr>
+                <w:rFonts w:ascii="Helvetica" w:hAnsi="Helvetica" w:eastAsia="Helvetica" w:cs="Helvetica"/>
+                <w:i w:val="false"/>
+                <w:b w:val="false"/>
+                <w:u w:val="none"/>
+                <w:sz w:val="22"/>
+                <w:szCs w:val="22"/>
+                <w:color w:val="000000"/>
+              </w:rPr>
+            </w:pPr>
+            <w:r>
+              <w:rPr>
+                <w:rFonts w:ascii="Helvetica" w:hAnsi="Helvetica" w:eastAsia="Helvetica" w:cs="Helvetica"/>
+                <w:i w:val="false"/>
+                <w:b w:val="false"/>
+                <w:u w:val="none"/>
+                <w:sz w:val="22"/>
+                <w:szCs w:val="22"/>
+                <w:color w:val="000000"/>
+              </w:rPr>
+              <w:t xml:space="preserve">Uniform (mean: 21 bp)</w:t>
+            </w:r>
+          </w:p>
+        </w:tc>
+        <w:tc>
+          <w:tcPr>
+            <w:tcBorders>
+              <w:bottom w:val="none" w:sz="0" w:space="0" w:color="000000"/>
+              <w:top w:val="none" w:sz="0" w:space="0" w:color="000000"/>
+              <w:left w:val="none" w:sz="0" w:space="0" w:color="000000"/>
+              <w:right w:val="none" w:sz="0" w:space="0" w:color="000000"/>
+            </w:tcBorders>
+            <w:shd w:val="clear" w:color="auto" w:fill="FFFFFF"/>
+            <w:tcMar>
+              <w:top w:w="0" w:type="dxa"/>
+              <w:bottom w:w="0" w:type="dxa"/>
+              <w:left w:w="0" w:type="dxa"/>
+              <w:right w:w="0" w:type="dxa"/>
+            </w:tcMar>
+            <w:vAlign w:val="center"/>
+          </w:tcPr>
+          <w:p>
+            <w:pPr>
+              <w:pStyle w:val="Normal"/>
+              <w:jc w:val="left"/>
+              <w:pBdr>
+                <w:bottom w:val="none" w:sz="0" w:space="0" w:color="000000"/>
+                <w:top w:val="none" w:sz="0" w:space="0" w:color="000000"/>
+                <w:left w:val="none" w:sz="0" w:space="0" w:color="000000"/>
+                <w:right w:val="none" w:sz="0" w:space="0" w:color="000000"/>
+              </w:pBdr>
+              <w:spacing w:after="100" w:before="100" w:line="240"/>
+              <w:ind w:left="100" w:right="100" w:firstLine="0" w:firstLineChars="0"/>
+              <w:rPr>
+                <w:rFonts w:ascii="Helvetica" w:hAnsi="Helvetica" w:eastAsia="Helvetica" w:cs="Helvetica"/>
+                <w:i w:val="false"/>
+                <w:b w:val="false"/>
+                <w:u w:val="none"/>
+                <w:sz w:val="22"/>
+                <w:szCs w:val="22"/>
+                <w:color w:val="000000"/>
+              </w:rPr>
+            </w:pPr>
+            <w:r>
+              <w:rPr>
+                <w:rFonts w:ascii="Helvetica" w:hAnsi="Helvetica" w:eastAsia="Helvetica" w:cs="Helvetica"/>
+                <w:i w:val="false"/>
+                <w:b w:val="false"/>
+                <w:u w:val="none"/>
+                <w:sz w:val="22"/>
+                <w:szCs w:val="22"/>
+                <w:color w:val="000000"/>
+              </w:rPr>
+              <w:t xml:space="preserve">Geom2</w:t>
+            </w:r>
+          </w:p>
+        </w:tc>
+        <w:tc>
+          <w:tcPr>
+            <w:tcBorders>
+              <w:bottom w:val="none" w:sz="0" w:space="0" w:color="000000"/>
+              <w:top w:val="none" w:sz="0" w:space="0" w:color="000000"/>
+              <w:left w:val="none" w:sz="0" w:space="0" w:color="000000"/>
+              <w:right w:val="none" w:sz="0" w:space="0" w:color="000000"/>
+            </w:tcBorders>
+            <w:shd w:val="clear" w:color="auto" w:fill="FFFFFF"/>
+            <w:tcMar>
+              <w:top w:w="0" w:type="dxa"/>
+              <w:bottom w:w="0" w:type="dxa"/>
+              <w:left w:w="0" w:type="dxa"/>
+              <w:right w:w="0" w:type="dxa"/>
+            </w:tcMar>
+            <w:vAlign w:val="center"/>
+          </w:tcPr>
+          <w:p>
+            <w:pPr>
+              <w:pStyle w:val="Normal"/>
+              <w:jc w:val="right"/>
+              <w:pBdr>
+                <w:bottom w:val="none" w:sz="0" w:space="0" w:color="000000"/>
+                <w:top w:val="none" w:sz="0" w:space="0" w:color="000000"/>
+                <w:left w:val="none" w:sz="0" w:space="0" w:color="000000"/>
+                <w:right w:val="none" w:sz="0" w:space="0" w:color="000000"/>
+              </w:pBdr>
+              <w:spacing w:after="100" w:before="100" w:line="240"/>
+              <w:ind w:left="100" w:right="100" w:firstLine="0" w:firstLineChars="0"/>
+              <w:rPr>
+                <w:rFonts w:ascii="Helvetica" w:hAnsi="Helvetica" w:eastAsia="Helvetica" w:cs="Helvetica"/>
+                <w:i w:val="false"/>
+                <w:b w:val="false"/>
+                <w:u w:val="none"/>
+                <w:sz w:val="22"/>
+                <w:szCs w:val="22"/>
+                <w:color w:val="000000"/>
+              </w:rPr>
+            </w:pPr>
+            <w:r>
+              <w:rPr>
+                <w:rFonts w:ascii="Helvetica" w:hAnsi="Helvetica" w:eastAsia="Helvetica" w:cs="Helvetica"/>
+                <w:i w:val="false"/>
+                <w:b w:val="false"/>
+                <w:u w:val="none"/>
+                <w:sz w:val="22"/>
+                <w:szCs w:val="22"/>
+                <w:color w:val="000000"/>
+              </w:rPr>
+              <w:t xml:space="preserve">99</w:t>
+            </w:r>
+          </w:p>
+        </w:tc>
+      </w:tr>
+      <w:tr>
+        <w:trPr>
+          <w:trHeight w:val="360" w:hRule="auto"/>
+        </w:trPr>
+        body21
+        <w:tc>
+          <w:tcPr>
+            <w:tcBorders>
+              <w:bottom w:val="none" w:sz="0" w:space="0" w:color="000000"/>
+              <w:top w:val="none" w:sz="0" w:space="0" w:color="000000"/>
+              <w:left w:val="none" w:sz="0" w:space="0" w:color="000000"/>
+              <w:right w:val="none" w:sz="0" w:space="0" w:color="000000"/>
+            </w:tcBorders>
+            <w:shd w:val="clear" w:color="auto" w:fill="FFFFFF"/>
+            <w:tcMar>
+              <w:top w:w="0" w:type="dxa"/>
+              <w:bottom w:w="0" w:type="dxa"/>
+              <w:left w:w="0" w:type="dxa"/>
+              <w:right w:w="0" w:type="dxa"/>
+            </w:tcMar>
+            <w:vAlign w:val="center"/>
+          </w:tcPr>
+          <w:p>
+            <w:pPr>
+              <w:pStyle w:val="Normal"/>
+              <w:jc w:val="left"/>
+              <w:pBdr>
+                <w:bottom w:val="none" w:sz="0" w:space="0" w:color="000000"/>
+                <w:top w:val="none" w:sz="0" w:space="0" w:color="000000"/>
+                <w:left w:val="none" w:sz="0" w:space="0" w:color="000000"/>
+                <w:right w:val="none" w:sz="0" w:space="0" w:color="000000"/>
+              </w:pBdr>
+              <w:spacing w:after="100" w:before="100" w:line="240"/>
+              <w:ind w:left="100" w:right="100" w:firstLine="0" w:firstLineChars="0"/>
+              <w:rPr>
+                <w:rFonts w:ascii="Helvetica" w:hAnsi="Helvetica" w:eastAsia="Helvetica" w:cs="Helvetica"/>
+                <w:i w:val="false"/>
+                <w:b w:val="false"/>
+                <w:u w:val="none"/>
+                <w:sz w:val="22"/>
+                <w:szCs w:val="22"/>
+                <w:color w:val="000000"/>
+              </w:rPr>
+            </w:pPr>
+            <w:r>
+              <w:rPr>
+                <w:rFonts w:ascii="Helvetica" w:hAnsi="Helvetica" w:eastAsia="Helvetica" w:cs="Helvetica"/>
+                <w:i w:val="false"/>
+                <w:b w:val="false"/>
+                <w:u w:val="none"/>
+                <w:sz w:val="22"/>
+                <w:szCs w:val="22"/>
+                <w:color w:val="000000"/>
+              </w:rPr>
+              <w:t xml:space="preserve">Uniform (mean: 21 bp)</w:t>
+            </w:r>
+          </w:p>
+        </w:tc>
+        <w:tc>
+          <w:tcPr>
+            <w:tcBorders>
+              <w:bottom w:val="none" w:sz="0" w:space="0" w:color="000000"/>
+              <w:top w:val="none" w:sz="0" w:space="0" w:color="000000"/>
+              <w:left w:val="none" w:sz="0" w:space="0" w:color="000000"/>
+              <w:right w:val="none" w:sz="0" w:space="0" w:color="000000"/>
+            </w:tcBorders>
+            <w:shd w:val="clear" w:color="auto" w:fill="FFFFFF"/>
+            <w:tcMar>
+              <w:top w:w="0" w:type="dxa"/>
+              <w:bottom w:w="0" w:type="dxa"/>
+              <w:left w:w="0" w:type="dxa"/>
+              <w:right w:w="0" w:type="dxa"/>
+            </w:tcMar>
+            <w:vAlign w:val="center"/>
+          </w:tcPr>
+          <w:p>
+            <w:pPr>
+              <w:pStyle w:val="Normal"/>
+              <w:jc w:val="left"/>
+              <w:pBdr>
+                <w:bottom w:val="none" w:sz="0" w:space="0" w:color="000000"/>
+                <w:top w:val="none" w:sz="0" w:space="0" w:color="000000"/>
+                <w:left w:val="none" w:sz="0" w:space="0" w:color="000000"/>
+                <w:right w:val="none" w:sz="0" w:space="0" w:color="000000"/>
+              </w:pBdr>
+              <w:spacing w:after="100" w:before="100" w:line="240"/>
+              <w:ind w:left="100" w:right="100" w:firstLine="0" w:firstLineChars="0"/>
+              <w:rPr>
+                <w:rFonts w:ascii="Helvetica" w:hAnsi="Helvetica" w:eastAsia="Helvetica" w:cs="Helvetica"/>
+                <w:i w:val="false"/>
+                <w:b w:val="false"/>
+                <w:u w:val="none"/>
+                <w:sz w:val="22"/>
+                <w:szCs w:val="22"/>
+                <w:color w:val="000000"/>
+              </w:rPr>
+            </w:pPr>
+            <w:r>
+              <w:rPr>
+                <w:rFonts w:ascii="Helvetica" w:hAnsi="Helvetica" w:eastAsia="Helvetica" w:cs="Helvetica"/>
+                <w:i w:val="false"/>
+                <w:b w:val="false"/>
+                <w:u w:val="none"/>
+                <w:sz w:val="22"/>
+                <w:szCs w:val="22"/>
+                <w:color w:val="000000"/>
+              </w:rPr>
+              <w:t xml:space="preserve">Mixture</w:t>
+            </w:r>
+          </w:p>
+        </w:tc>
+        <w:tc>
+          <w:tcPr>
+            <w:tcBorders>
+              <w:bottom w:val="none" w:sz="0" w:space="0" w:color="000000"/>
+              <w:top w:val="none" w:sz="0" w:space="0" w:color="000000"/>
+              <w:left w:val="none" w:sz="0" w:space="0" w:color="000000"/>
+              <w:right w:val="none" w:sz="0" w:space="0" w:color="000000"/>
+            </w:tcBorders>
+            <w:shd w:val="clear" w:color="auto" w:fill="FFFFFF"/>
+            <w:tcMar>
+              <w:top w:w="0" w:type="dxa"/>
+              <w:bottom w:w="0" w:type="dxa"/>
+              <w:left w:w="0" w:type="dxa"/>
+              <w:right w:w="0" w:type="dxa"/>
+            </w:tcMar>
+            <w:vAlign w:val="center"/>
+          </w:tcPr>
+          <w:p>
+            <w:pPr>
+              <w:pStyle w:val="Normal"/>
+              <w:jc w:val="right"/>
+              <w:pBdr>
+                <w:bottom w:val="none" w:sz="0" w:space="0" w:color="000000"/>
+                <w:top w:val="none" w:sz="0" w:space="0" w:color="000000"/>
+                <w:left w:val="none" w:sz="0" w:space="0" w:color="000000"/>
+                <w:right w:val="none" w:sz="0" w:space="0" w:color="000000"/>
+              </w:pBdr>
+              <w:spacing w:after="100" w:before="100" w:line="240"/>
+              <w:ind w:left="100" w:right="100" w:firstLine="0" w:firstLineChars="0"/>
+              <w:rPr>
+                <w:rFonts w:ascii="Helvetica" w:hAnsi="Helvetica" w:eastAsia="Helvetica" w:cs="Helvetica"/>
+                <w:i w:val="false"/>
+                <w:b w:val="false"/>
+                <w:u w:val="none"/>
+                <w:sz w:val="22"/>
+                <w:szCs w:val="22"/>
+                <w:color w:val="000000"/>
+              </w:rPr>
+            </w:pPr>
+            <w:r>
+              <w:rPr>
+                <w:rFonts w:ascii="Helvetica" w:hAnsi="Helvetica" w:eastAsia="Helvetica" w:cs="Helvetica"/>
+                <w:i w:val="false"/>
+                <w:b w:val="false"/>
+                <w:u w:val="none"/>
+                <w:sz w:val="22"/>
+                <w:szCs w:val="22"/>
+                <w:color w:val="000000"/>
+              </w:rPr>
+              <w:t xml:space="preserve">0</w:t>
+            </w:r>
+          </w:p>
+        </w:tc>
+      </w:tr>
+      <w:tr>
+        <w:trPr>
+          <w:trHeight w:val="360" w:hRule="auto"/>
+        </w:trPr>
+        body22
+        <w:tc>
+          <w:tcPr>
+            <w:tcBorders>
+              <w:bottom w:val="none" w:sz="0" w:space="0" w:color="000000"/>
+              <w:top w:val="none" w:sz="0" w:space="0" w:color="000000"/>
+              <w:left w:val="none" w:sz="0" w:space="0" w:color="000000"/>
+              <w:right w:val="none" w:sz="0" w:space="0" w:color="000000"/>
+            </w:tcBorders>
+            <w:shd w:val="clear" w:color="auto" w:fill="FFFFFF"/>
+            <w:tcMar>
+              <w:top w:w="0" w:type="dxa"/>
+              <w:bottom w:w="0" w:type="dxa"/>
+              <w:left w:w="0" w:type="dxa"/>
+              <w:right w:w="0" w:type="dxa"/>
+            </w:tcMar>
+            <w:vAlign w:val="center"/>
+          </w:tcPr>
+          <w:p>
+            <w:pPr>
+              <w:pStyle w:val="Normal"/>
+              <w:jc w:val="left"/>
+              <w:pBdr>
+                <w:bottom w:val="none" w:sz="0" w:space="0" w:color="000000"/>
+                <w:top w:val="none" w:sz="0" w:space="0" w:color="000000"/>
+                <w:left w:val="none" w:sz="0" w:space="0" w:color="000000"/>
+                <w:right w:val="none" w:sz="0" w:space="0" w:color="000000"/>
+              </w:pBdr>
+              <w:spacing w:after="100" w:before="100" w:line="240"/>
+              <w:ind w:left="100" w:right="100" w:firstLine="0" w:firstLineChars="0"/>
+              <w:rPr>
+                <w:rFonts w:ascii="Helvetica" w:hAnsi="Helvetica" w:eastAsia="Helvetica" w:cs="Helvetica"/>
+                <w:i w:val="false"/>
+                <w:b w:val="false"/>
+                <w:u w:val="none"/>
+                <w:sz w:val="22"/>
+                <w:szCs w:val="22"/>
+                <w:color w:val="000000"/>
+              </w:rPr>
+            </w:pPr>
+            <w:r>
+              <w:rPr>
+                <w:rFonts w:ascii="Helvetica" w:hAnsi="Helvetica" w:eastAsia="Helvetica" w:cs="Helvetica"/>
+                <w:i w:val="false"/>
+                <w:b w:val="false"/>
+                <w:u w:val="none"/>
+                <w:sz w:val="22"/>
+                <w:szCs w:val="22"/>
+                <w:color w:val="000000"/>
+              </w:rPr>
+              <w:t xml:space="preserve">Uniform (mean: 100 bp)</w:t>
+            </w:r>
+          </w:p>
+        </w:tc>
+        <w:tc>
+          <w:tcPr>
+            <w:tcBorders>
+              <w:bottom w:val="none" w:sz="0" w:space="0" w:color="000000"/>
+              <w:top w:val="none" w:sz="0" w:space="0" w:color="000000"/>
+              <w:left w:val="none" w:sz="0" w:space="0" w:color="000000"/>
+              <w:right w:val="none" w:sz="0" w:space="0" w:color="000000"/>
+            </w:tcBorders>
+            <w:shd w:val="clear" w:color="auto" w:fill="FFFFFF"/>
+            <w:tcMar>
+              <w:top w:w="0" w:type="dxa"/>
+              <w:bottom w:w="0" w:type="dxa"/>
+              <w:left w:w="0" w:type="dxa"/>
+              <w:right w:w="0" w:type="dxa"/>
+            </w:tcMar>
+            <w:vAlign w:val="center"/>
+          </w:tcPr>
+          <w:p>
+            <w:pPr>
+              <w:pStyle w:val="Normal"/>
+              <w:jc w:val="left"/>
+              <w:pBdr>
+                <w:bottom w:val="none" w:sz="0" w:space="0" w:color="000000"/>
+                <w:top w:val="none" w:sz="0" w:space="0" w:color="000000"/>
+                <w:left w:val="none" w:sz="0" w:space="0" w:color="000000"/>
+                <w:right w:val="none" w:sz="0" w:space="0" w:color="000000"/>
+              </w:pBdr>
+              <w:spacing w:after="100" w:before="100" w:line="240"/>
+              <w:ind w:left="100" w:right="100" w:firstLine="0" w:firstLineChars="0"/>
+              <w:rPr>
+                <w:rFonts w:ascii="Helvetica" w:hAnsi="Helvetica" w:eastAsia="Helvetica" w:cs="Helvetica"/>
+                <w:i w:val="false"/>
+                <w:b w:val="false"/>
+                <w:u w:val="none"/>
+                <w:sz w:val="22"/>
+                <w:szCs w:val="22"/>
+                <w:color w:val="000000"/>
+              </w:rPr>
+            </w:pPr>
+            <w:r>
+              <w:rPr>
+                <w:rFonts w:ascii="Helvetica" w:hAnsi="Helvetica" w:eastAsia="Helvetica" w:cs="Helvetica"/>
+                <w:i w:val="false"/>
+                <w:b w:val="false"/>
+                <w:u w:val="none"/>
+                <w:sz w:val="22"/>
+                <w:szCs w:val="22"/>
+                <w:color w:val="000000"/>
+              </w:rPr>
+              <w:t xml:space="preserve">Geom</w:t>
+            </w:r>
+          </w:p>
+        </w:tc>
+        <w:tc>
+          <w:tcPr>
+            <w:tcBorders>
+              <w:bottom w:val="none" w:sz="0" w:space="0" w:color="000000"/>
+              <w:top w:val="none" w:sz="0" w:space="0" w:color="000000"/>
+              <w:left w:val="none" w:sz="0" w:space="0" w:color="000000"/>
+              <w:right w:val="none" w:sz="0" w:space="0" w:color="000000"/>
+            </w:tcBorders>
+            <w:shd w:val="clear" w:color="auto" w:fill="FFFFFF"/>
+            <w:tcMar>
+              <w:top w:w="0" w:type="dxa"/>
+              <w:bottom w:w="0" w:type="dxa"/>
+              <w:left w:w="0" w:type="dxa"/>
+              <w:right w:w="0" w:type="dxa"/>
+            </w:tcMar>
+            <w:vAlign w:val="center"/>
+          </w:tcPr>
+          <w:p>
+            <w:pPr>
+              <w:pStyle w:val="Normal"/>
+              <w:jc w:val="right"/>
+              <w:pBdr>
+                <w:bottom w:val="none" w:sz="0" w:space="0" w:color="000000"/>
+                <w:top w:val="none" w:sz="0" w:space="0" w:color="000000"/>
+                <w:left w:val="none" w:sz="0" w:space="0" w:color="000000"/>
+                <w:right w:val="none" w:sz="0" w:space="0" w:color="000000"/>
+              </w:pBdr>
+              <w:spacing w:after="100" w:before="100" w:line="240"/>
+              <w:ind w:left="100" w:right="100" w:firstLine="0" w:firstLineChars="0"/>
+              <w:rPr>
+                <w:rFonts w:ascii="Helvetica" w:hAnsi="Helvetica" w:eastAsia="Helvetica" w:cs="Helvetica"/>
+                <w:i w:val="false"/>
+                <w:b w:val="false"/>
+                <w:u w:val="none"/>
+                <w:sz w:val="22"/>
+                <w:szCs w:val="22"/>
+                <w:color w:val="000000"/>
+              </w:rPr>
+            </w:pPr>
+            <w:r>
+              <w:rPr>
+                <w:rFonts w:ascii="Helvetica" w:hAnsi="Helvetica" w:eastAsia="Helvetica" w:cs="Helvetica"/>
+                <w:i w:val="false"/>
+                <w:b w:val="false"/>
+                <w:u w:val="none"/>
+                <w:sz w:val="22"/>
+                <w:szCs w:val="22"/>
+                <w:color w:val="000000"/>
+              </w:rPr>
+              <w:t xml:space="preserve">0</w:t>
+            </w:r>
+          </w:p>
+        </w:tc>
+      </w:tr>
+      <w:tr>
+        <w:trPr>
+          <w:trHeight w:val="360" w:hRule="auto"/>
+        </w:trPr>
+        body23
+        <w:tc>
+          <w:tcPr>
+            <w:tcBorders>
+              <w:bottom w:val="none" w:sz="0" w:space="0" w:color="000000"/>
+              <w:top w:val="none" w:sz="0" w:space="0" w:color="000000"/>
+              <w:left w:val="none" w:sz="0" w:space="0" w:color="000000"/>
+              <w:right w:val="none" w:sz="0" w:space="0" w:color="000000"/>
+            </w:tcBorders>
+            <w:shd w:val="clear" w:color="auto" w:fill="FFFFFF"/>
+            <w:tcMar>
+              <w:top w:w="0" w:type="dxa"/>
+              <w:bottom w:w="0" w:type="dxa"/>
+              <w:left w:w="0" w:type="dxa"/>
+              <w:right w:w="0" w:type="dxa"/>
+            </w:tcMar>
+            <w:vAlign w:val="center"/>
+          </w:tcPr>
+          <w:p>
+            <w:pPr>
+              <w:pStyle w:val="Normal"/>
+              <w:jc w:val="left"/>
+              <w:pBdr>
+                <w:bottom w:val="none" w:sz="0" w:space="0" w:color="000000"/>
+                <w:top w:val="none" w:sz="0" w:space="0" w:color="000000"/>
+                <w:left w:val="none" w:sz="0" w:space="0" w:color="000000"/>
+                <w:right w:val="none" w:sz="0" w:space="0" w:color="000000"/>
+              </w:pBdr>
+              <w:spacing w:after="100" w:before="100" w:line="240"/>
+              <w:ind w:left="100" w:right="100" w:firstLine="0" w:firstLineChars="0"/>
+              <w:rPr>
+                <w:rFonts w:ascii="Helvetica" w:hAnsi="Helvetica" w:eastAsia="Helvetica" w:cs="Helvetica"/>
+                <w:i w:val="false"/>
+                <w:b w:val="false"/>
+                <w:u w:val="none"/>
+                <w:sz w:val="22"/>
+                <w:szCs w:val="22"/>
+                <w:color w:val="000000"/>
+              </w:rPr>
+            </w:pPr>
+            <w:r>
+              <w:rPr>
+                <w:rFonts w:ascii="Helvetica" w:hAnsi="Helvetica" w:eastAsia="Helvetica" w:cs="Helvetica"/>
+                <w:i w:val="false"/>
+                <w:b w:val="false"/>
+                <w:u w:val="none"/>
+                <w:sz w:val="22"/>
+                <w:szCs w:val="22"/>
+                <w:color w:val="000000"/>
+              </w:rPr>
+              <w:t xml:space="preserve">Uniform (mean: 100 bp)</w:t>
+            </w:r>
+          </w:p>
+        </w:tc>
+        <w:tc>
+          <w:tcPr>
+            <w:tcBorders>
+              <w:bottom w:val="none" w:sz="0" w:space="0" w:color="000000"/>
+              <w:top w:val="none" w:sz="0" w:space="0" w:color="000000"/>
+              <w:left w:val="none" w:sz="0" w:space="0" w:color="000000"/>
+              <w:right w:val="none" w:sz="0" w:space="0" w:color="000000"/>
+            </w:tcBorders>
+            <w:shd w:val="clear" w:color="auto" w:fill="FFFFFF"/>
+            <w:tcMar>
+              <w:top w:w="0" w:type="dxa"/>
+              <w:bottom w:w="0" w:type="dxa"/>
+              <w:left w:w="0" w:type="dxa"/>
+              <w:right w:w="0" w:type="dxa"/>
+            </w:tcMar>
+            <w:vAlign w:val="center"/>
+          </w:tcPr>
+          <w:p>
+            <w:pPr>
+              <w:pStyle w:val="Normal"/>
+              <w:jc w:val="left"/>
+              <w:pBdr>
+                <w:bottom w:val="none" w:sz="0" w:space="0" w:color="000000"/>
+                <w:top w:val="none" w:sz="0" w:space="0" w:color="000000"/>
+                <w:left w:val="none" w:sz="0" w:space="0" w:color="000000"/>
+                <w:right w:val="none" w:sz="0" w:space="0" w:color="000000"/>
+              </w:pBdr>
+              <w:spacing w:after="100" w:before="100" w:line="240"/>
+              <w:ind w:left="100" w:right="100" w:firstLine="0" w:firstLineChars="0"/>
+              <w:rPr>
+                <w:rFonts w:ascii="Helvetica" w:hAnsi="Helvetica" w:eastAsia="Helvetica" w:cs="Helvetica"/>
+                <w:i w:val="false"/>
+                <w:b w:val="false"/>
+                <w:u w:val="none"/>
+                <w:sz w:val="22"/>
+                <w:szCs w:val="22"/>
+                <w:color w:val="000000"/>
+              </w:rPr>
+            </w:pPr>
+            <w:r>
+              <w:rPr>
+                <w:rFonts w:ascii="Helvetica" w:hAnsi="Helvetica" w:eastAsia="Helvetica" w:cs="Helvetica"/>
+                <w:i w:val="false"/>
+                <w:b w:val="false"/>
+                <w:u w:val="none"/>
+                <w:sz w:val="22"/>
+                <w:szCs w:val="22"/>
+                <w:color w:val="000000"/>
+              </w:rPr>
+              <w:t xml:space="preserve">Geom2</w:t>
+            </w:r>
+          </w:p>
+        </w:tc>
+        <w:tc>
+          <w:tcPr>
+            <w:tcBorders>
+              <w:bottom w:val="none" w:sz="0" w:space="0" w:color="000000"/>
+              <w:top w:val="none" w:sz="0" w:space="0" w:color="000000"/>
+              <w:left w:val="none" w:sz="0" w:space="0" w:color="000000"/>
+              <w:right w:val="none" w:sz="0" w:space="0" w:color="000000"/>
+            </w:tcBorders>
+            <w:shd w:val="clear" w:color="auto" w:fill="FFFFFF"/>
+            <w:tcMar>
+              <w:top w:w="0" w:type="dxa"/>
+              <w:bottom w:w="0" w:type="dxa"/>
+              <w:left w:w="0" w:type="dxa"/>
+              <w:right w:w="0" w:type="dxa"/>
+            </w:tcMar>
+            <w:vAlign w:val="center"/>
+          </w:tcPr>
+          <w:p>
+            <w:pPr>
+              <w:pStyle w:val="Normal"/>
+              <w:jc w:val="right"/>
+              <w:pBdr>
+                <w:bottom w:val="none" w:sz="0" w:space="0" w:color="000000"/>
+                <w:top w:val="none" w:sz="0" w:space="0" w:color="000000"/>
+                <w:left w:val="none" w:sz="0" w:space="0" w:color="000000"/>
+                <w:right w:val="none" w:sz="0" w:space="0" w:color="000000"/>
+              </w:pBdr>
+              <w:spacing w:after="100" w:before="100" w:line="240"/>
+              <w:ind w:left="100" w:right="100" w:firstLine="0" w:firstLineChars="0"/>
+              <w:rPr>
+                <w:rFonts w:ascii="Helvetica" w:hAnsi="Helvetica" w:eastAsia="Helvetica" w:cs="Helvetica"/>
+                <w:i w:val="false"/>
+                <w:b w:val="false"/>
+                <w:u w:val="none"/>
+                <w:sz w:val="22"/>
+                <w:szCs w:val="22"/>
+                <w:color w:val="000000"/>
+              </w:rPr>
+            </w:pPr>
+            <w:r>
+              <w:rPr>
+                <w:rFonts w:ascii="Helvetica" w:hAnsi="Helvetica" w:eastAsia="Helvetica" w:cs="Helvetica"/>
+                <w:i w:val="false"/>
+                <w:b w:val="false"/>
+                <w:u w:val="none"/>
+                <w:sz w:val="22"/>
+                <w:szCs w:val="22"/>
+                <w:color w:val="000000"/>
+              </w:rPr>
+              <w:t xml:space="preserve">100</w:t>
+            </w:r>
+          </w:p>
+        </w:tc>
+      </w:tr>
+      <w:tr>
+        <w:trPr>
+          <w:trHeight w:val="360" w:hRule="auto"/>
+        </w:trPr>
+        body24
+        <w:tc>
+          <w:tcPr>
+            <w:tcBorders>
+              <w:bottom w:val="none" w:sz="0" w:space="0" w:color="000000"/>
+              <w:top w:val="none" w:sz="0" w:space="0" w:color="000000"/>
+              <w:left w:val="none" w:sz="0" w:space="0" w:color="000000"/>
+              <w:right w:val="none" w:sz="0" w:space="0" w:color="000000"/>
+            </w:tcBorders>
+            <w:shd w:val="clear" w:color="auto" w:fill="FFFFFF"/>
+            <w:tcMar>
+              <w:top w:w="0" w:type="dxa"/>
+              <w:bottom w:w="0" w:type="dxa"/>
+              <w:left w:w="0" w:type="dxa"/>
+              <w:right w:w="0" w:type="dxa"/>
+            </w:tcMar>
+            <w:vAlign w:val="center"/>
+          </w:tcPr>
+          <w:p>
+            <w:pPr>
+              <w:pStyle w:val="Normal"/>
+              <w:jc w:val="left"/>
+              <w:pBdr>
+                <w:bottom w:val="none" w:sz="0" w:space="0" w:color="000000"/>
+                <w:top w:val="none" w:sz="0" w:space="0" w:color="000000"/>
+                <w:left w:val="none" w:sz="0" w:space="0" w:color="000000"/>
+                <w:right w:val="none" w:sz="0" w:space="0" w:color="000000"/>
+              </w:pBdr>
+              <w:spacing w:after="100" w:before="100" w:line="240"/>
+              <w:ind w:left="100" w:right="100" w:firstLine="0" w:firstLineChars="0"/>
+              <w:rPr>
+                <w:rFonts w:ascii="Helvetica" w:hAnsi="Helvetica" w:eastAsia="Helvetica" w:cs="Helvetica"/>
+                <w:i w:val="false"/>
+                <w:b w:val="false"/>
+                <w:u w:val="none"/>
+                <w:sz w:val="22"/>
+                <w:szCs w:val="22"/>
+                <w:color w:val="000000"/>
+              </w:rPr>
+            </w:pPr>
+            <w:r>
+              <w:rPr>
+                <w:rFonts w:ascii="Helvetica" w:hAnsi="Helvetica" w:eastAsia="Helvetica" w:cs="Helvetica"/>
+                <w:i w:val="false"/>
+                <w:b w:val="false"/>
+                <w:u w:val="none"/>
+                <w:sz w:val="22"/>
+                <w:szCs w:val="22"/>
+                <w:color w:val="000000"/>
+              </w:rPr>
+              <w:t xml:space="preserve">Uniform (mean: 100 bp)</w:t>
+            </w:r>
+          </w:p>
+        </w:tc>
+        <w:tc>
+          <w:tcPr>
+            <w:tcBorders>
+              <w:bottom w:val="none" w:sz="0" w:space="0" w:color="000000"/>
+              <w:top w:val="none" w:sz="0" w:space="0" w:color="000000"/>
+              <w:left w:val="none" w:sz="0" w:space="0" w:color="000000"/>
+              <w:right w:val="none" w:sz="0" w:space="0" w:color="000000"/>
+            </w:tcBorders>
+            <w:shd w:val="clear" w:color="auto" w:fill="FFFFFF"/>
+            <w:tcMar>
+              <w:top w:w="0" w:type="dxa"/>
+              <w:bottom w:w="0" w:type="dxa"/>
+              <w:left w:w="0" w:type="dxa"/>
+              <w:right w:w="0" w:type="dxa"/>
+            </w:tcMar>
+            <w:vAlign w:val="center"/>
+          </w:tcPr>
+          <w:p>
+            <w:pPr>
+              <w:pStyle w:val="Normal"/>
+              <w:jc w:val="left"/>
+              <w:pBdr>
+                <w:bottom w:val="none" w:sz="0" w:space="0" w:color="000000"/>
+                <w:top w:val="none" w:sz="0" w:space="0" w:color="000000"/>
+                <w:left w:val="none" w:sz="0" w:space="0" w:color="000000"/>
+                <w:right w:val="none" w:sz="0" w:space="0" w:color="000000"/>
+              </w:pBdr>
+              <w:spacing w:after="100" w:before="100" w:line="240"/>
+              <w:ind w:left="100" w:right="100" w:firstLine="0" w:firstLineChars="0"/>
+              <w:rPr>
+                <w:rFonts w:ascii="Helvetica" w:hAnsi="Helvetica" w:eastAsia="Helvetica" w:cs="Helvetica"/>
+                <w:i w:val="false"/>
+                <w:b w:val="false"/>
+                <w:u w:val="none"/>
+                <w:sz w:val="22"/>
+                <w:szCs w:val="22"/>
+                <w:color w:val="000000"/>
+              </w:rPr>
+            </w:pPr>
+            <w:r>
+              <w:rPr>
+                <w:rFonts w:ascii="Helvetica" w:hAnsi="Helvetica" w:eastAsia="Helvetica" w:cs="Helvetica"/>
+                <w:i w:val="false"/>
+                <w:b w:val="false"/>
+                <w:u w:val="none"/>
+                <w:sz w:val="22"/>
+                <w:szCs w:val="22"/>
+                <w:color w:val="000000"/>
+              </w:rPr>
+              <w:t xml:space="preserve">Mixture</w:t>
+            </w:r>
+          </w:p>
+        </w:tc>
+        <w:tc>
+          <w:tcPr>
+            <w:tcBorders>
+              <w:bottom w:val="none" w:sz="0" w:space="0" w:color="000000"/>
+              <w:top w:val="none" w:sz="0" w:space="0" w:color="000000"/>
+              <w:left w:val="none" w:sz="0" w:space="0" w:color="000000"/>
+              <w:right w:val="none" w:sz="0" w:space="0" w:color="000000"/>
+            </w:tcBorders>
+            <w:shd w:val="clear" w:color="auto" w:fill="FFFFFF"/>
+            <w:tcMar>
+              <w:top w:w="0" w:type="dxa"/>
+              <w:bottom w:w="0" w:type="dxa"/>
+              <w:left w:w="0" w:type="dxa"/>
+              <w:right w:w="0" w:type="dxa"/>
+            </w:tcMar>
+            <w:vAlign w:val="center"/>
+          </w:tcPr>
+          <w:p>
+            <w:pPr>
+              <w:pStyle w:val="Normal"/>
+              <w:jc w:val="right"/>
+              <w:pBdr>
+                <w:bottom w:val="none" w:sz="0" w:space="0" w:color="000000"/>
+                <w:top w:val="none" w:sz="0" w:space="0" w:color="000000"/>
+                <w:left w:val="none" w:sz="0" w:space="0" w:color="000000"/>
+                <w:right w:val="none" w:sz="0" w:space="0" w:color="000000"/>
+              </w:pBdr>
+              <w:spacing w:after="100" w:before="100" w:line="240"/>
+              <w:ind w:left="100" w:right="100" w:firstLine="0" w:firstLineChars="0"/>
+              <w:rPr>
+                <w:rFonts w:ascii="Helvetica" w:hAnsi="Helvetica" w:eastAsia="Helvetica" w:cs="Helvetica"/>
+                <w:i w:val="false"/>
+                <w:b w:val="false"/>
+                <w:u w:val="none"/>
+                <w:sz w:val="22"/>
+                <w:szCs w:val="22"/>
+                <w:color w:val="000000"/>
+              </w:rPr>
+            </w:pPr>
+            <w:r>
+              <w:rPr>
+                <w:rFonts w:ascii="Helvetica" w:hAnsi="Helvetica" w:eastAsia="Helvetica" w:cs="Helvetica"/>
+                <w:i w:val="false"/>
+                <w:b w:val="false"/>
+                <w:u w:val="none"/>
+                <w:sz w:val="22"/>
+                <w:szCs w:val="22"/>
+                <w:color w:val="000000"/>
+              </w:rPr>
+              <w:t xml:space="preserve">0</w:t>
+            </w:r>
+          </w:p>
+        </w:tc>
+      </w:tr>
+      <w:tr>
+        <w:trPr>
+          <w:trHeight w:val="360" w:hRule="auto"/>
+        </w:trPr>
+        body25
+        <w:tc>
+          <w:tcPr>
+            <w:tcBorders>
+              <w:bottom w:val="none" w:sz="0" w:space="0" w:color="000000"/>
+              <w:top w:val="none" w:sz="0" w:space="0" w:color="000000"/>
+              <w:left w:val="none" w:sz="0" w:space="0" w:color="000000"/>
+              <w:right w:val="none" w:sz="0" w:space="0" w:color="000000"/>
+            </w:tcBorders>
+            <w:shd w:val="clear" w:color="auto" w:fill="FFFFFF"/>
+            <w:tcMar>
+              <w:top w:w="0" w:type="dxa"/>
+              <w:bottom w:w="0" w:type="dxa"/>
+              <w:left w:w="0" w:type="dxa"/>
+              <w:right w:w="0" w:type="dxa"/>
+            </w:tcMar>
+            <w:vAlign w:val="center"/>
+          </w:tcPr>
+          <w:p>
+            <w:pPr>
+              <w:pStyle w:val="Normal"/>
+              <w:jc w:val="left"/>
+              <w:pBdr>
+                <w:bottom w:val="none" w:sz="0" w:space="0" w:color="000000"/>
+                <w:top w:val="none" w:sz="0" w:space="0" w:color="000000"/>
+                <w:left w:val="none" w:sz="0" w:space="0" w:color="000000"/>
+                <w:right w:val="none" w:sz="0" w:space="0" w:color="000000"/>
+              </w:pBdr>
+              <w:spacing w:after="100" w:before="100" w:line="240"/>
+              <w:ind w:left="100" w:right="100" w:firstLine="0" w:firstLineChars="0"/>
+              <w:rPr>
+                <w:rFonts w:ascii="Helvetica" w:hAnsi="Helvetica" w:eastAsia="Helvetica" w:cs="Helvetica"/>
+                <w:i w:val="false"/>
+                <w:b w:val="false"/>
+                <w:u w:val="none"/>
+                <w:sz w:val="22"/>
+                <w:szCs w:val="22"/>
+                <w:color w:val="000000"/>
+              </w:rPr>
+            </w:pPr>
+            <w:r>
+              <w:rPr>
+                <w:rFonts w:ascii="Helvetica" w:hAnsi="Helvetica" w:eastAsia="Helvetica" w:cs="Helvetica"/>
+                <w:i w:val="false"/>
+                <w:b w:val="false"/>
+                <w:u w:val="none"/>
+                <w:sz w:val="22"/>
+                <w:szCs w:val="22"/>
+                <w:color w:val="000000"/>
+              </w:rPr>
+              <w:t xml:space="preserve">Mixture (mean: 21 bp)</w:t>
+            </w:r>
+          </w:p>
+        </w:tc>
+        <w:tc>
+          <w:tcPr>
+            <w:tcBorders>
+              <w:bottom w:val="none" w:sz="0" w:space="0" w:color="000000"/>
+              <w:top w:val="none" w:sz="0" w:space="0" w:color="000000"/>
+              <w:left w:val="none" w:sz="0" w:space="0" w:color="000000"/>
+              <w:right w:val="none" w:sz="0" w:space="0" w:color="000000"/>
+            </w:tcBorders>
+            <w:shd w:val="clear" w:color="auto" w:fill="FFFFFF"/>
+            <w:tcMar>
+              <w:top w:w="0" w:type="dxa"/>
+              <w:bottom w:w="0" w:type="dxa"/>
+              <w:left w:w="0" w:type="dxa"/>
+              <w:right w:w="0" w:type="dxa"/>
+            </w:tcMar>
+            <w:vAlign w:val="center"/>
+          </w:tcPr>
+          <w:p>
+            <w:pPr>
+              <w:pStyle w:val="Normal"/>
+              <w:jc w:val="left"/>
+              <w:pBdr>
+                <w:bottom w:val="none" w:sz="0" w:space="0" w:color="000000"/>
+                <w:top w:val="none" w:sz="0" w:space="0" w:color="000000"/>
+                <w:left w:val="none" w:sz="0" w:space="0" w:color="000000"/>
+                <w:right w:val="none" w:sz="0" w:space="0" w:color="000000"/>
+              </w:pBdr>
+              <w:spacing w:after="100" w:before="100" w:line="240"/>
+              <w:ind w:left="100" w:right="100" w:firstLine="0" w:firstLineChars="0"/>
+              <w:rPr>
+                <w:rFonts w:ascii="Helvetica" w:hAnsi="Helvetica" w:eastAsia="Helvetica" w:cs="Helvetica"/>
+                <w:i w:val="false"/>
+                <w:b w:val="false"/>
+                <w:u w:val="none"/>
+                <w:sz w:val="22"/>
+                <w:szCs w:val="22"/>
+                <w:color w:val="000000"/>
+              </w:rPr>
+            </w:pPr>
+            <w:r>
+              <w:rPr>
+                <w:rFonts w:ascii="Helvetica" w:hAnsi="Helvetica" w:eastAsia="Helvetica" w:cs="Helvetica"/>
+                <w:i w:val="false"/>
+                <w:b w:val="false"/>
+                <w:u w:val="none"/>
+                <w:sz w:val="22"/>
+                <w:szCs w:val="22"/>
+                <w:color w:val="000000"/>
+              </w:rPr>
+              <w:t xml:space="preserve">Geom</w:t>
+            </w:r>
+          </w:p>
+        </w:tc>
+        <w:tc>
+          <w:tcPr>
+            <w:tcBorders>
+              <w:bottom w:val="none" w:sz="0" w:space="0" w:color="000000"/>
+              <w:top w:val="none" w:sz="0" w:space="0" w:color="000000"/>
+              <w:left w:val="none" w:sz="0" w:space="0" w:color="000000"/>
+              <w:right w:val="none" w:sz="0" w:space="0" w:color="000000"/>
+            </w:tcBorders>
+            <w:shd w:val="clear" w:color="auto" w:fill="FFFFFF"/>
+            <w:tcMar>
+              <w:top w:w="0" w:type="dxa"/>
+              <w:bottom w:w="0" w:type="dxa"/>
+              <w:left w:w="0" w:type="dxa"/>
+              <w:right w:w="0" w:type="dxa"/>
+            </w:tcMar>
+            <w:vAlign w:val="center"/>
+          </w:tcPr>
+          <w:p>
+            <w:pPr>
+              <w:pStyle w:val="Normal"/>
+              <w:jc w:val="right"/>
+              <w:pBdr>
+                <w:bottom w:val="none" w:sz="0" w:space="0" w:color="000000"/>
+                <w:top w:val="none" w:sz="0" w:space="0" w:color="000000"/>
+                <w:left w:val="none" w:sz="0" w:space="0" w:color="000000"/>
+                <w:right w:val="none" w:sz="0" w:space="0" w:color="000000"/>
+              </w:pBdr>
+              <w:spacing w:after="100" w:before="100" w:line="240"/>
+              <w:ind w:left="100" w:right="100" w:firstLine="0" w:firstLineChars="0"/>
+              <w:rPr>
+                <w:rFonts w:ascii="Helvetica" w:hAnsi="Helvetica" w:eastAsia="Helvetica" w:cs="Helvetica"/>
+                <w:i w:val="false"/>
+                <w:b w:val="false"/>
+                <w:u w:val="none"/>
+                <w:sz w:val="22"/>
+                <w:szCs w:val="22"/>
+                <w:color w:val="000000"/>
+              </w:rPr>
+            </w:pPr>
+            <w:r>
+              <w:rPr>
+                <w:rFonts w:ascii="Helvetica" w:hAnsi="Helvetica" w:eastAsia="Helvetica" w:cs="Helvetica"/>
+                <w:i w:val="false"/>
+                <w:b w:val="false"/>
+                <w:u w:val="none"/>
+                <w:sz w:val="22"/>
+                <w:szCs w:val="22"/>
+                <w:color w:val="000000"/>
+              </w:rPr>
+              <w:t xml:space="preserve">4</w:t>
+            </w:r>
+          </w:p>
+        </w:tc>
+      </w:tr>
+      <w:tr>
+        <w:trPr>
+          <w:trHeight w:val="360" w:hRule="auto"/>
+        </w:trPr>
+        body26
+        <w:tc>
+          <w:tcPr>
+            <w:tcBorders>
+              <w:bottom w:val="none" w:sz="0" w:space="0" w:color="000000"/>
+              <w:top w:val="none" w:sz="0" w:space="0" w:color="000000"/>
+              <w:left w:val="none" w:sz="0" w:space="0" w:color="000000"/>
+              <w:right w:val="none" w:sz="0" w:space="0" w:color="000000"/>
+            </w:tcBorders>
+            <w:shd w:val="clear" w:color="auto" w:fill="FFFFFF"/>
+            <w:tcMar>
+              <w:top w:w="0" w:type="dxa"/>
+              <w:bottom w:w="0" w:type="dxa"/>
+              <w:left w:w="0" w:type="dxa"/>
+              <w:right w:w="0" w:type="dxa"/>
+            </w:tcMar>
+            <w:vAlign w:val="center"/>
+          </w:tcPr>
+          <w:p>
+            <w:pPr>
+              <w:pStyle w:val="Normal"/>
+              <w:jc w:val="left"/>
+              <w:pBdr>
+                <w:bottom w:val="none" w:sz="0" w:space="0" w:color="000000"/>
+                <w:top w:val="none" w:sz="0" w:space="0" w:color="000000"/>
+                <w:left w:val="none" w:sz="0" w:space="0" w:color="000000"/>
+                <w:right w:val="none" w:sz="0" w:space="0" w:color="000000"/>
+              </w:pBdr>
+              <w:spacing w:after="100" w:before="100" w:line="240"/>
+              <w:ind w:left="100" w:right="100" w:firstLine="0" w:firstLineChars="0"/>
+              <w:rPr>
+                <w:rFonts w:ascii="Helvetica" w:hAnsi="Helvetica" w:eastAsia="Helvetica" w:cs="Helvetica"/>
+                <w:i w:val="false"/>
+                <w:b w:val="false"/>
+                <w:u w:val="none"/>
+                <w:sz w:val="22"/>
+                <w:szCs w:val="22"/>
+                <w:color w:val="000000"/>
+              </w:rPr>
+            </w:pPr>
+            <w:r>
+              <w:rPr>
+                <w:rFonts w:ascii="Helvetica" w:hAnsi="Helvetica" w:eastAsia="Helvetica" w:cs="Helvetica"/>
+                <w:i w:val="false"/>
+                <w:b w:val="false"/>
+                <w:u w:val="none"/>
+                <w:sz w:val="22"/>
+                <w:szCs w:val="22"/>
+                <w:color w:val="000000"/>
+              </w:rPr>
+              <w:t xml:space="preserve">Mixture (mean: 21 bp)</w:t>
+            </w:r>
+          </w:p>
+        </w:tc>
+        <w:tc>
+          <w:tcPr>
+            <w:tcBorders>
+              <w:bottom w:val="none" w:sz="0" w:space="0" w:color="000000"/>
+              <w:top w:val="none" w:sz="0" w:space="0" w:color="000000"/>
+              <w:left w:val="none" w:sz="0" w:space="0" w:color="000000"/>
+              <w:right w:val="none" w:sz="0" w:space="0" w:color="000000"/>
+            </w:tcBorders>
+            <w:shd w:val="clear" w:color="auto" w:fill="FFFFFF"/>
+            <w:tcMar>
+              <w:top w:w="0" w:type="dxa"/>
+              <w:bottom w:w="0" w:type="dxa"/>
+              <w:left w:w="0" w:type="dxa"/>
+              <w:right w:w="0" w:type="dxa"/>
+            </w:tcMar>
+            <w:vAlign w:val="center"/>
+          </w:tcPr>
+          <w:p>
+            <w:pPr>
+              <w:pStyle w:val="Normal"/>
+              <w:jc w:val="left"/>
+              <w:pBdr>
+                <w:bottom w:val="none" w:sz="0" w:space="0" w:color="000000"/>
+                <w:top w:val="none" w:sz="0" w:space="0" w:color="000000"/>
+                <w:left w:val="none" w:sz="0" w:space="0" w:color="000000"/>
+                <w:right w:val="none" w:sz="0" w:space="0" w:color="000000"/>
+              </w:pBdr>
+              <w:spacing w:after="100" w:before="100" w:line="240"/>
+              <w:ind w:left="100" w:right="100" w:firstLine="0" w:firstLineChars="0"/>
+              <w:rPr>
+                <w:rFonts w:ascii="Helvetica" w:hAnsi="Helvetica" w:eastAsia="Helvetica" w:cs="Helvetica"/>
+                <w:i w:val="false"/>
+                <w:b w:val="false"/>
+                <w:u w:val="none"/>
+                <w:sz w:val="22"/>
+                <w:szCs w:val="22"/>
+                <w:color w:val="000000"/>
+              </w:rPr>
+            </w:pPr>
+            <w:r>
+              <w:rPr>
+                <w:rFonts w:ascii="Helvetica" w:hAnsi="Helvetica" w:eastAsia="Helvetica" w:cs="Helvetica"/>
+                <w:i w:val="false"/>
+                <w:b w:val="false"/>
+                <w:u w:val="none"/>
+                <w:sz w:val="22"/>
+                <w:szCs w:val="22"/>
+                <w:color w:val="000000"/>
+              </w:rPr>
+              <w:t xml:space="preserve">Geom2</w:t>
+            </w:r>
+          </w:p>
+        </w:tc>
+        <w:tc>
+          <w:tcPr>
+            <w:tcBorders>
+              <w:bottom w:val="none" w:sz="0" w:space="0" w:color="000000"/>
+              <w:top w:val="none" w:sz="0" w:space="0" w:color="000000"/>
+              <w:left w:val="none" w:sz="0" w:space="0" w:color="000000"/>
+              <w:right w:val="none" w:sz="0" w:space="0" w:color="000000"/>
+            </w:tcBorders>
+            <w:shd w:val="clear" w:color="auto" w:fill="FFFFFF"/>
+            <w:tcMar>
+              <w:top w:w="0" w:type="dxa"/>
+              <w:bottom w:w="0" w:type="dxa"/>
+              <w:left w:w="0" w:type="dxa"/>
+              <w:right w:w="0" w:type="dxa"/>
+            </w:tcMar>
+            <w:vAlign w:val="center"/>
+          </w:tcPr>
+          <w:p>
+            <w:pPr>
+              <w:pStyle w:val="Normal"/>
+              <w:jc w:val="right"/>
+              <w:pBdr>
+                <w:bottom w:val="none" w:sz="0" w:space="0" w:color="000000"/>
+                <w:top w:val="none" w:sz="0" w:space="0" w:color="000000"/>
+                <w:left w:val="none" w:sz="0" w:space="0" w:color="000000"/>
+                <w:right w:val="none" w:sz="0" w:space="0" w:color="000000"/>
+              </w:pBdr>
+              <w:spacing w:after="100" w:before="100" w:line="240"/>
+              <w:ind w:left="100" w:right="100" w:firstLine="0" w:firstLineChars="0"/>
+              <w:rPr>
+                <w:rFonts w:ascii="Helvetica" w:hAnsi="Helvetica" w:eastAsia="Helvetica" w:cs="Helvetica"/>
+                <w:i w:val="false"/>
+                <w:b w:val="false"/>
+                <w:u w:val="none"/>
+                <w:sz w:val="22"/>
+                <w:szCs w:val="22"/>
+                <w:color w:val="000000"/>
+              </w:rPr>
+            </w:pPr>
+            <w:r>
+              <w:rPr>
+                <w:rFonts w:ascii="Helvetica" w:hAnsi="Helvetica" w:eastAsia="Helvetica" w:cs="Helvetica"/>
+                <w:i w:val="false"/>
+                <w:b w:val="false"/>
+                <w:u w:val="none"/>
+                <w:sz w:val="22"/>
+                <w:szCs w:val="22"/>
+                <w:color w:val="000000"/>
+              </w:rPr>
+              <w:t xml:space="preserve">0</w:t>
+            </w:r>
+          </w:p>
+        </w:tc>
+      </w:tr>
+      <w:tr>
+        <w:trPr>
+          <w:trHeight w:val="360" w:hRule="auto"/>
+        </w:trPr>
+        body27
+        <w:tc>
+          <w:tcPr>
+            <w:tcBorders>
+              <w:bottom w:val="none" w:sz="0" w:space="0" w:color="000000"/>
+              <w:top w:val="none" w:sz="0" w:space="0" w:color="000000"/>
+              <w:left w:val="none" w:sz="0" w:space="0" w:color="000000"/>
+              <w:right w:val="none" w:sz="0" w:space="0" w:color="000000"/>
+            </w:tcBorders>
+            <w:shd w:val="clear" w:color="auto" w:fill="FFFFFF"/>
+            <w:tcMar>
+              <w:top w:w="0" w:type="dxa"/>
+              <w:bottom w:w="0" w:type="dxa"/>
+              <w:left w:w="0" w:type="dxa"/>
+              <w:right w:w="0" w:type="dxa"/>
+            </w:tcMar>
+            <w:vAlign w:val="center"/>
+          </w:tcPr>
+          <w:p>
+            <w:pPr>
+              <w:pStyle w:val="Normal"/>
+              <w:jc w:val="left"/>
+              <w:pBdr>
+                <w:bottom w:val="none" w:sz="0" w:space="0" w:color="000000"/>
+                <w:top w:val="none" w:sz="0" w:space="0" w:color="000000"/>
+                <w:left w:val="none" w:sz="0" w:space="0" w:color="000000"/>
+                <w:right w:val="none" w:sz="0" w:space="0" w:color="000000"/>
+              </w:pBdr>
+              <w:spacing w:after="100" w:before="100" w:line="240"/>
+              <w:ind w:left="100" w:right="100" w:firstLine="0" w:firstLineChars="0"/>
+              <w:rPr>
+                <w:rFonts w:ascii="Helvetica" w:hAnsi="Helvetica" w:eastAsia="Helvetica" w:cs="Helvetica"/>
+                <w:i w:val="false"/>
+                <w:b w:val="false"/>
+                <w:u w:val="none"/>
+                <w:sz w:val="22"/>
+                <w:szCs w:val="22"/>
+                <w:color w:val="000000"/>
+              </w:rPr>
+            </w:pPr>
+            <w:r>
+              <w:rPr>
+                <w:rFonts w:ascii="Helvetica" w:hAnsi="Helvetica" w:eastAsia="Helvetica" w:cs="Helvetica"/>
+                <w:i w:val="false"/>
+                <w:b w:val="false"/>
+                <w:u w:val="none"/>
+                <w:sz w:val="22"/>
+                <w:szCs w:val="22"/>
+                <w:color w:val="000000"/>
+              </w:rPr>
+              <w:t xml:space="preserve">Mixture (mean: 21 bp)</w:t>
+            </w:r>
+          </w:p>
+        </w:tc>
+        <w:tc>
+          <w:tcPr>
+            <w:tcBorders>
+              <w:bottom w:val="none" w:sz="0" w:space="0" w:color="000000"/>
+              <w:top w:val="none" w:sz="0" w:space="0" w:color="000000"/>
+              <w:left w:val="none" w:sz="0" w:space="0" w:color="000000"/>
+              <w:right w:val="none" w:sz="0" w:space="0" w:color="000000"/>
+            </w:tcBorders>
+            <w:shd w:val="clear" w:color="auto" w:fill="FFFFFF"/>
+            <w:tcMar>
+              <w:top w:w="0" w:type="dxa"/>
+              <w:bottom w:w="0" w:type="dxa"/>
+              <w:left w:w="0" w:type="dxa"/>
+              <w:right w:w="0" w:type="dxa"/>
+            </w:tcMar>
+            <w:vAlign w:val="center"/>
+          </w:tcPr>
+          <w:p>
+            <w:pPr>
+              <w:pStyle w:val="Normal"/>
+              <w:jc w:val="left"/>
+              <w:pBdr>
+                <w:bottom w:val="none" w:sz="0" w:space="0" w:color="000000"/>
+                <w:top w:val="none" w:sz="0" w:space="0" w:color="000000"/>
+                <w:left w:val="none" w:sz="0" w:space="0" w:color="000000"/>
+                <w:right w:val="none" w:sz="0" w:space="0" w:color="000000"/>
+              </w:pBdr>
+              <w:spacing w:after="100" w:before="100" w:line="240"/>
+              <w:ind w:left="100" w:right="100" w:firstLine="0" w:firstLineChars="0"/>
+              <w:rPr>
+                <w:rFonts w:ascii="Helvetica" w:hAnsi="Helvetica" w:eastAsia="Helvetica" w:cs="Helvetica"/>
+                <w:i w:val="false"/>
+                <w:b w:val="false"/>
+                <w:u w:val="none"/>
+                <w:sz w:val="22"/>
+                <w:szCs w:val="22"/>
+                <w:color w:val="000000"/>
+              </w:rPr>
+            </w:pPr>
+            <w:r>
+              <w:rPr>
+                <w:rFonts w:ascii="Helvetica" w:hAnsi="Helvetica" w:eastAsia="Helvetica" w:cs="Helvetica"/>
+                <w:i w:val="false"/>
+                <w:b w:val="false"/>
+                <w:u w:val="none"/>
+                <w:sz w:val="22"/>
+                <w:szCs w:val="22"/>
+                <w:color w:val="000000"/>
+              </w:rPr>
+              <w:t xml:space="preserve">Mixture</w:t>
+            </w:r>
+          </w:p>
+        </w:tc>
+        <w:tc>
+          <w:tcPr>
+            <w:tcBorders>
+              <w:bottom w:val="none" w:sz="0" w:space="0" w:color="000000"/>
+              <w:top w:val="none" w:sz="0" w:space="0" w:color="000000"/>
+              <w:left w:val="none" w:sz="0" w:space="0" w:color="000000"/>
+              <w:right w:val="none" w:sz="0" w:space="0" w:color="000000"/>
+            </w:tcBorders>
+            <w:shd w:val="clear" w:color="auto" w:fill="FFFFFF"/>
+            <w:tcMar>
+              <w:top w:w="0" w:type="dxa"/>
+              <w:bottom w:w="0" w:type="dxa"/>
+              <w:left w:w="0" w:type="dxa"/>
+              <w:right w:w="0" w:type="dxa"/>
+            </w:tcMar>
+            <w:vAlign w:val="center"/>
+          </w:tcPr>
+          <w:p>
+            <w:pPr>
+              <w:pStyle w:val="Normal"/>
+              <w:jc w:val="right"/>
+              <w:pBdr>
+                <w:bottom w:val="none" w:sz="0" w:space="0" w:color="000000"/>
+                <w:top w:val="none" w:sz="0" w:space="0" w:color="000000"/>
+                <w:left w:val="none" w:sz="0" w:space="0" w:color="000000"/>
+                <w:right w:val="none" w:sz="0" w:space="0" w:color="000000"/>
+              </w:pBdr>
+              <w:spacing w:after="100" w:before="100" w:line="240"/>
+              <w:ind w:left="100" w:right="100" w:firstLine="0" w:firstLineChars="0"/>
+              <w:rPr>
+                <w:rFonts w:ascii="Helvetica" w:hAnsi="Helvetica" w:eastAsia="Helvetica" w:cs="Helvetica"/>
+                <w:i w:val="false"/>
+                <w:b w:val="false"/>
+                <w:u w:val="none"/>
+                <w:sz w:val="22"/>
+                <w:szCs w:val="22"/>
+                <w:color w:val="000000"/>
+              </w:rPr>
+            </w:pPr>
+            <w:r>
+              <w:rPr>
+                <w:rFonts w:ascii="Helvetica" w:hAnsi="Helvetica" w:eastAsia="Helvetica" w:cs="Helvetica"/>
+                <w:i w:val="false"/>
+                <w:b w:val="false"/>
+                <w:u w:val="none"/>
+                <w:sz w:val="22"/>
+                <w:szCs w:val="22"/>
+                <w:color w:val="000000"/>
+              </w:rPr>
+              <w:t xml:space="preserve">96</w:t>
+            </w:r>
+          </w:p>
+        </w:tc>
+      </w:tr>
+      <w:tr>
+        <w:trPr>
+          <w:trHeight w:val="360" w:hRule="auto"/>
+        </w:trPr>
+        body28
+        <w:tc>
+          <w:tcPr>
+            <w:tcBorders>
+              <w:bottom w:val="none" w:sz="0" w:space="0" w:color="000000"/>
+              <w:top w:val="none" w:sz="0" w:space="0" w:color="000000"/>
+              <w:left w:val="none" w:sz="0" w:space="0" w:color="000000"/>
+              <w:right w:val="none" w:sz="0" w:space="0" w:color="000000"/>
+            </w:tcBorders>
+            <w:shd w:val="clear" w:color="auto" w:fill="FFFFFF"/>
+            <w:tcMar>
+              <w:top w:w="0" w:type="dxa"/>
+              <w:bottom w:w="0" w:type="dxa"/>
+              <w:left w:w="0" w:type="dxa"/>
+              <w:right w:w="0" w:type="dxa"/>
+            </w:tcMar>
+            <w:vAlign w:val="center"/>
+          </w:tcPr>
+          <w:p>
+            <w:pPr>
+              <w:pStyle w:val="Normal"/>
+              <w:jc w:val="left"/>
+              <w:pBdr>
+                <w:bottom w:val="none" w:sz="0" w:space="0" w:color="000000"/>
+                <w:top w:val="none" w:sz="0" w:space="0" w:color="000000"/>
+                <w:left w:val="none" w:sz="0" w:space="0" w:color="000000"/>
+                <w:right w:val="none" w:sz="0" w:space="0" w:color="000000"/>
+              </w:pBdr>
+              <w:spacing w:after="100" w:before="100" w:line="240"/>
+              <w:ind w:left="100" w:right="100" w:firstLine="0" w:firstLineChars="0"/>
+              <w:rPr>
+                <w:rFonts w:ascii="Helvetica" w:hAnsi="Helvetica" w:eastAsia="Helvetica" w:cs="Helvetica"/>
+                <w:i w:val="false"/>
+                <w:b w:val="false"/>
+                <w:u w:val="none"/>
+                <w:sz w:val="22"/>
+                <w:szCs w:val="22"/>
+                <w:color w:val="000000"/>
+              </w:rPr>
+            </w:pPr>
+            <w:r>
+              <w:rPr>
+                <w:rFonts w:ascii="Helvetica" w:hAnsi="Helvetica" w:eastAsia="Helvetica" w:cs="Helvetica"/>
+                <w:i w:val="false"/>
+                <w:b w:val="false"/>
+                <w:u w:val="none"/>
+                <w:sz w:val="22"/>
+                <w:szCs w:val="22"/>
+                <w:color w:val="000000"/>
+              </w:rPr>
+              <w:t xml:space="preserve">Mixture (mean: 100 bp)</w:t>
+            </w:r>
+          </w:p>
+        </w:tc>
+        <w:tc>
+          <w:tcPr>
+            <w:tcBorders>
+              <w:bottom w:val="none" w:sz="0" w:space="0" w:color="000000"/>
+              <w:top w:val="none" w:sz="0" w:space="0" w:color="000000"/>
+              <w:left w:val="none" w:sz="0" w:space="0" w:color="000000"/>
+              <w:right w:val="none" w:sz="0" w:space="0" w:color="000000"/>
+            </w:tcBorders>
+            <w:shd w:val="clear" w:color="auto" w:fill="FFFFFF"/>
+            <w:tcMar>
+              <w:top w:w="0" w:type="dxa"/>
+              <w:bottom w:w="0" w:type="dxa"/>
+              <w:left w:w="0" w:type="dxa"/>
+              <w:right w:w="0" w:type="dxa"/>
+            </w:tcMar>
+            <w:vAlign w:val="center"/>
+          </w:tcPr>
+          <w:p>
+            <w:pPr>
+              <w:pStyle w:val="Normal"/>
+              <w:jc w:val="left"/>
+              <w:pBdr>
+                <w:bottom w:val="none" w:sz="0" w:space="0" w:color="000000"/>
+                <w:top w:val="none" w:sz="0" w:space="0" w:color="000000"/>
+                <w:left w:val="none" w:sz="0" w:space="0" w:color="000000"/>
+                <w:right w:val="none" w:sz="0" w:space="0" w:color="000000"/>
+              </w:pBdr>
+              <w:spacing w:after="100" w:before="100" w:line="240"/>
+              <w:ind w:left="100" w:right="100" w:firstLine="0" w:firstLineChars="0"/>
+              <w:rPr>
+                <w:rFonts w:ascii="Helvetica" w:hAnsi="Helvetica" w:eastAsia="Helvetica" w:cs="Helvetica"/>
+                <w:i w:val="false"/>
+                <w:b w:val="false"/>
+                <w:u w:val="none"/>
+                <w:sz w:val="22"/>
+                <w:szCs w:val="22"/>
+                <w:color w:val="000000"/>
+              </w:rPr>
+            </w:pPr>
+            <w:r>
+              <w:rPr>
+                <w:rFonts w:ascii="Helvetica" w:hAnsi="Helvetica" w:eastAsia="Helvetica" w:cs="Helvetica"/>
+                <w:i w:val="false"/>
+                <w:b w:val="false"/>
+                <w:u w:val="none"/>
+                <w:sz w:val="22"/>
+                <w:szCs w:val="22"/>
+                <w:color w:val="000000"/>
+              </w:rPr>
+              <w:t xml:space="preserve">Geom</w:t>
+            </w:r>
+          </w:p>
+        </w:tc>
+        <w:tc>
+          <w:tcPr>
+            <w:tcBorders>
+              <w:bottom w:val="none" w:sz="0" w:space="0" w:color="000000"/>
+              <w:top w:val="none" w:sz="0" w:space="0" w:color="000000"/>
+              <w:left w:val="none" w:sz="0" w:space="0" w:color="000000"/>
+              <w:right w:val="none" w:sz="0" w:space="0" w:color="000000"/>
+            </w:tcBorders>
+            <w:shd w:val="clear" w:color="auto" w:fill="FFFFFF"/>
+            <w:tcMar>
+              <w:top w:w="0" w:type="dxa"/>
+              <w:bottom w:w="0" w:type="dxa"/>
+              <w:left w:w="0" w:type="dxa"/>
+              <w:right w:w="0" w:type="dxa"/>
+            </w:tcMar>
+            <w:vAlign w:val="center"/>
+          </w:tcPr>
+          <w:p>
+            <w:pPr>
+              <w:pStyle w:val="Normal"/>
+              <w:jc w:val="right"/>
+              <w:pBdr>
+                <w:bottom w:val="none" w:sz="0" w:space="0" w:color="000000"/>
+                <w:top w:val="none" w:sz="0" w:space="0" w:color="000000"/>
+                <w:left w:val="none" w:sz="0" w:space="0" w:color="000000"/>
+                <w:right w:val="none" w:sz="0" w:space="0" w:color="000000"/>
+              </w:pBdr>
+              <w:spacing w:after="100" w:before="100" w:line="240"/>
+              <w:ind w:left="100" w:right="100" w:firstLine="0" w:firstLineChars="0"/>
+              <w:rPr>
+                <w:rFonts w:ascii="Helvetica" w:hAnsi="Helvetica" w:eastAsia="Helvetica" w:cs="Helvetica"/>
+                <w:i w:val="false"/>
+                <w:b w:val="false"/>
+                <w:u w:val="none"/>
+                <w:sz w:val="22"/>
+                <w:szCs w:val="22"/>
+                <w:color w:val="000000"/>
+              </w:rPr>
+            </w:pPr>
+            <w:r>
+              <w:rPr>
+                <w:rFonts w:ascii="Helvetica" w:hAnsi="Helvetica" w:eastAsia="Helvetica" w:cs="Helvetica"/>
+                <w:i w:val="false"/>
+                <w:b w:val="false"/>
+                <w:u w:val="none"/>
+                <w:sz w:val="22"/>
+                <w:szCs w:val="22"/>
+                <w:color w:val="000000"/>
+              </w:rPr>
+              <w:t xml:space="preserve">2</w:t>
+            </w:r>
+          </w:p>
+        </w:tc>
+      </w:tr>
+      <w:tr>
+        <w:trPr>
+          <w:trHeight w:val="360" w:hRule="auto"/>
+        </w:trPr>
+        body29
+        <w:tc>
+          <w:tcPr>
+            <w:tcBorders>
+              <w:bottom w:val="none" w:sz="0" w:space="0" w:color="000000"/>
+              <w:top w:val="none" w:sz="0" w:space="0" w:color="000000"/>
+              <w:left w:val="none" w:sz="0" w:space="0" w:color="000000"/>
+              <w:right w:val="none" w:sz="0" w:space="0" w:color="000000"/>
+            </w:tcBorders>
+            <w:shd w:val="clear" w:color="auto" w:fill="FFFFFF"/>
+            <w:tcMar>
+              <w:top w:w="0" w:type="dxa"/>
+              <w:bottom w:w="0" w:type="dxa"/>
+              <w:left w:w="0" w:type="dxa"/>
+              <w:right w:w="0" w:type="dxa"/>
+            </w:tcMar>
+            <w:vAlign w:val="center"/>
+          </w:tcPr>
+          <w:p>
+            <w:pPr>
+              <w:pStyle w:val="Normal"/>
+              <w:jc w:val="left"/>
+              <w:pBdr>
+                <w:bottom w:val="none" w:sz="0" w:space="0" w:color="000000"/>
+                <w:top w:val="none" w:sz="0" w:space="0" w:color="000000"/>
+                <w:left w:val="none" w:sz="0" w:space="0" w:color="000000"/>
+                <w:right w:val="none" w:sz="0" w:space="0" w:color="000000"/>
+              </w:pBdr>
+              <w:spacing w:after="100" w:before="100" w:line="240"/>
+              <w:ind w:left="100" w:right="100" w:firstLine="0" w:firstLineChars="0"/>
+              <w:rPr>
+                <w:rFonts w:ascii="Helvetica" w:hAnsi="Helvetica" w:eastAsia="Helvetica" w:cs="Helvetica"/>
+                <w:i w:val="false"/>
+                <w:b w:val="false"/>
+                <w:u w:val="none"/>
+                <w:sz w:val="22"/>
+                <w:szCs w:val="22"/>
+                <w:color w:val="000000"/>
+              </w:rPr>
+            </w:pPr>
+            <w:r>
+              <w:rPr>
+                <w:rFonts w:ascii="Helvetica" w:hAnsi="Helvetica" w:eastAsia="Helvetica" w:cs="Helvetica"/>
+                <w:i w:val="false"/>
+                <w:b w:val="false"/>
+                <w:u w:val="none"/>
+                <w:sz w:val="22"/>
+                <w:szCs w:val="22"/>
+                <w:color w:val="000000"/>
+              </w:rPr>
+              <w:t xml:space="preserve">Mixture (mean: 100 bp)</w:t>
+            </w:r>
+          </w:p>
+        </w:tc>
+        <w:tc>
+          <w:tcPr>
+            <w:tcBorders>
+              <w:bottom w:val="none" w:sz="0" w:space="0" w:color="000000"/>
+              <w:top w:val="none" w:sz="0" w:space="0" w:color="000000"/>
+              <w:left w:val="none" w:sz="0" w:space="0" w:color="000000"/>
+              <w:right w:val="none" w:sz="0" w:space="0" w:color="000000"/>
+            </w:tcBorders>
+            <w:shd w:val="clear" w:color="auto" w:fill="FFFFFF"/>
+            <w:tcMar>
+              <w:top w:w="0" w:type="dxa"/>
+              <w:bottom w:w="0" w:type="dxa"/>
+              <w:left w:w="0" w:type="dxa"/>
+              <w:right w:w="0" w:type="dxa"/>
+            </w:tcMar>
+            <w:vAlign w:val="center"/>
+          </w:tcPr>
+          <w:p>
+            <w:pPr>
+              <w:pStyle w:val="Normal"/>
+              <w:jc w:val="left"/>
+              <w:pBdr>
+                <w:bottom w:val="none" w:sz="0" w:space="0" w:color="000000"/>
+                <w:top w:val="none" w:sz="0" w:space="0" w:color="000000"/>
+                <w:left w:val="none" w:sz="0" w:space="0" w:color="000000"/>
+                <w:right w:val="none" w:sz="0" w:space="0" w:color="000000"/>
+              </w:pBdr>
+              <w:spacing w:after="100" w:before="100" w:line="240"/>
+              <w:ind w:left="100" w:right="100" w:firstLine="0" w:firstLineChars="0"/>
+              <w:rPr>
+                <w:rFonts w:ascii="Helvetica" w:hAnsi="Helvetica" w:eastAsia="Helvetica" w:cs="Helvetica"/>
+                <w:i w:val="false"/>
+                <w:b w:val="false"/>
+                <w:u w:val="none"/>
+                <w:sz w:val="22"/>
+                <w:szCs w:val="22"/>
+                <w:color w:val="000000"/>
+              </w:rPr>
+            </w:pPr>
+            <w:r>
+              <w:rPr>
+                <w:rFonts w:ascii="Helvetica" w:hAnsi="Helvetica" w:eastAsia="Helvetica" w:cs="Helvetica"/>
+                <w:i w:val="false"/>
+                <w:b w:val="false"/>
+                <w:u w:val="none"/>
+                <w:sz w:val="22"/>
+                <w:szCs w:val="22"/>
+                <w:color w:val="000000"/>
+              </w:rPr>
+              <w:t xml:space="preserve">Geom2</w:t>
+            </w:r>
+          </w:p>
+        </w:tc>
+        <w:tc>
+          <w:tcPr>
+            <w:tcBorders>
+              <w:bottom w:val="none" w:sz="0" w:space="0" w:color="000000"/>
+              <w:top w:val="none" w:sz="0" w:space="0" w:color="000000"/>
+              <w:left w:val="none" w:sz="0" w:space="0" w:color="000000"/>
+              <w:right w:val="none" w:sz="0" w:space="0" w:color="000000"/>
+            </w:tcBorders>
+            <w:shd w:val="clear" w:color="auto" w:fill="FFFFFF"/>
+            <w:tcMar>
+              <w:top w:w="0" w:type="dxa"/>
+              <w:bottom w:w="0" w:type="dxa"/>
+              <w:left w:w="0" w:type="dxa"/>
+              <w:right w:w="0" w:type="dxa"/>
+            </w:tcMar>
+            <w:vAlign w:val="center"/>
+          </w:tcPr>
+          <w:p>
+            <w:pPr>
+              <w:pStyle w:val="Normal"/>
+              <w:jc w:val="right"/>
+              <w:pBdr>
+                <w:bottom w:val="none" w:sz="0" w:space="0" w:color="000000"/>
+                <w:top w:val="none" w:sz="0" w:space="0" w:color="000000"/>
+                <w:left w:val="none" w:sz="0" w:space="0" w:color="000000"/>
+                <w:right w:val="none" w:sz="0" w:space="0" w:color="000000"/>
+              </w:pBdr>
+              <w:spacing w:after="100" w:before="100" w:line="240"/>
+              <w:ind w:left="100" w:right="100" w:firstLine="0" w:firstLineChars="0"/>
+              <w:rPr>
+                <w:rFonts w:ascii="Helvetica" w:hAnsi="Helvetica" w:eastAsia="Helvetica" w:cs="Helvetica"/>
+                <w:i w:val="false"/>
+                <w:b w:val="false"/>
+                <w:u w:val="none"/>
+                <w:sz w:val="22"/>
+                <w:szCs w:val="22"/>
+                <w:color w:val="000000"/>
+              </w:rPr>
+            </w:pPr>
+            <w:r>
+              <w:rPr>
+                <w:rFonts w:ascii="Helvetica" w:hAnsi="Helvetica" w:eastAsia="Helvetica" w:cs="Helvetica"/>
+                <w:i w:val="false"/>
+                <w:b w:val="false"/>
+                <w:u w:val="none"/>
+                <w:sz w:val="22"/>
+                <w:szCs w:val="22"/>
+                <w:color w:val="000000"/>
+              </w:rPr>
+              <w:t xml:space="preserve">0</w:t>
+            </w:r>
+          </w:p>
+        </w:tc>
+      </w:tr>
+      <w:tr>
+        <w:trPr>
+          <w:trHeight w:val="360" w:hRule="auto"/>
+        </w:trPr>
+        body30
+        <w:tc>
+          <w:tcPr>
+            <w:tcBorders>
               <w:bottom w:val="single" w:sz="12" w:space="0" w:color="666666"/>
               <w:top w:val="none" w:sz="0" w:space="0" w:color="000000"/>
               <w:left w:val="none" w:sz="0" w:space="0" w:color="000000"/>
@@ -2543,7 +5018,7 @@
                 <w:szCs w:val="22"/>
                 <w:color w:val="000000"/>
               </w:rPr>
-              <w:t xml:space="preserve">Unif</w:t>
+              <w:t xml:space="preserve">Mixture (mean: 100 bp)</w:t>
             </w:r>
           </w:p>
         </w:tc>
@@ -2596,7 +5071,7 @@
                 <w:szCs w:val="22"/>
                 <w:color w:val="000000"/>
               </w:rPr>
-              <w:t xml:space="preserve">Geom2</w:t>
+              <w:t xml:space="preserve">Mixture</w:t>
             </w:r>
           </w:p>
         </w:tc>
@@ -2649,7 +5124,7 @@
                 <w:szCs w:val="22"/>
                 <w:color w:val="000000"/>
               </w:rPr>
-              <w:t xml:space="preserve">100</w:t>
+              <w:t xml:space="preserve">98</w:t>
             </w:r>
           </w:p>
         </w:tc>

</xml_diff>